<commit_message>
completed 3 and presentation
</commit_message>
<xml_diff>
--- a/3. Industry and Technology Landscape Analysis.docx
+++ b/3. Industry and Technology Landscape Analysis.docx
@@ -634,528 +634,1055 @@
         <w:rPr>
           <w:color w:val="000000"/>
         </w:rPr>
+        <w:t>, 2026)</w:t>
+      </w:r>
+      <w:r>
+        <w:rPr>
+          <w:color w:val="000000"/>
+        </w:rPr>
+        <w:t xml:space="preserve">. </w:t>
+      </w:r>
+      <w:r>
+        <w:rPr>
+          <w:color w:val="000000"/>
+        </w:rPr>
+        <w:t>MedTalk and MediBetter partnership</w:t>
+      </w:r>
+      <w:r>
+        <w:rPr>
+          <w:color w:val="000000"/>
+        </w:rPr>
+        <w:t xml:space="preserve"> tech-tech</w:t>
+      </w:r>
+      <w:r>
+        <w:rPr>
+          <w:color w:val="000000"/>
+        </w:rPr>
+        <w:t xml:space="preserve"> API</w:t>
+      </w:r>
+      <w:r>
+        <w:rPr>
+          <w:color w:val="000000"/>
+        </w:rPr>
+        <w:t xml:space="preserve"> prices</w:t>
+      </w:r>
+      <w:r>
+        <w:rPr>
+          <w:color w:val="000000"/>
+        </w:rPr>
+        <w:t xml:space="preserve"> </w:t>
+      </w:r>
+      <w:r>
+        <w:rPr>
+          <w:color w:val="000000"/>
+        </w:rPr>
+        <w:t>are not</w:t>
+      </w:r>
+      <w:r>
+        <w:rPr>
+          <w:color w:val="000000"/>
+        </w:rPr>
+        <w:t xml:space="preserve"> publicly </w:t>
+      </w:r>
+      <w:r>
+        <w:rPr>
+          <w:color w:val="000000"/>
+        </w:rPr>
+        <w:t>available</w:t>
+      </w:r>
+      <w:r>
+        <w:rPr>
+          <w:color w:val="000000"/>
+        </w:rPr>
+        <w:t xml:space="preserve"> but according </w:t>
+      </w:r>
+      <w:r>
+        <w:rPr>
+          <w:color w:val="000000"/>
+        </w:rPr>
+        <w:t>to MarkiTech.AI</w:t>
+      </w:r>
+      <w:r>
+        <w:rPr>
+          <w:color w:val="000000"/>
+        </w:rPr>
+        <w:t xml:space="preserve"> (2025</w:t>
+      </w:r>
+      <w:r>
+        <w:rPr>
+          <w:color w:val="000000"/>
+        </w:rPr>
+        <w:t>)</w:t>
+      </w:r>
+      <w:r>
+        <w:rPr>
+          <w:color w:val="000000"/>
+        </w:rPr>
+        <w:t>,</w:t>
+      </w:r>
+      <w:r>
+        <w:rPr>
+          <w:color w:val="000000"/>
+        </w:rPr>
+        <w:t xml:space="preserve"> a</w:t>
+      </w:r>
+      <w:r>
+        <w:rPr>
+          <w:color w:val="000000"/>
+        </w:rPr>
+        <w:t xml:space="preserve"> flat fee </w:t>
+      </w:r>
+      <w:r>
+        <w:rPr>
+          <w:color w:val="000000"/>
+        </w:rPr>
+        <w:t>ranges</w:t>
+      </w:r>
+      <w:r>
+        <w:rPr>
+          <w:color w:val="000000"/>
+        </w:rPr>
+        <w:t xml:space="preserve"> from $100 to $500</w:t>
+      </w:r>
+      <w:r>
+        <w:rPr>
+          <w:color w:val="000000"/>
+        </w:rPr>
+        <w:t>. This ex</w:t>
+      </w:r>
+      <w:r>
+        <w:rPr>
+          <w:color w:val="000000"/>
+        </w:rPr>
+        <w:t xml:space="preserve">cludes the </w:t>
+      </w:r>
+      <w:r>
+        <w:rPr>
+          <w:color w:val="000000"/>
+        </w:rPr>
+        <w:t xml:space="preserve">subscription of the MediBetter professional suite which </w:t>
+      </w:r>
+      <w:r>
+        <w:rPr>
+          <w:color w:val="000000"/>
+        </w:rPr>
+        <w:t>unlocks the BOSS engine and browser extensions for clinical workflow.</w:t>
+      </w:r>
+      <w:r>
+        <w:rPr>
+          <w:color w:val="000000"/>
+        </w:rPr>
+        <w:t xml:space="preserve"> </w:t>
+      </w:r>
+      <w:r>
+        <w:rPr>
+          <w:color w:val="000000"/>
+        </w:rPr>
+        <w:t xml:space="preserve">These integration and subscription costs represent a significant financial pain point for </w:t>
+      </w:r>
+      <w:r>
+        <w:rPr>
+          <w:color w:val="000000"/>
+        </w:rPr>
+        <w:t xml:space="preserve">MedTalk, focusing </w:t>
+      </w:r>
+      <w:r>
+        <w:rPr>
+          <w:color w:val="000000"/>
+        </w:rPr>
+        <w:t>on the high upfront investment required for full bidirectional FHIR integration with Epic.</w:t>
+      </w:r>
+      <w:r>
+        <w:rPr>
+          <w:color w:val="000000"/>
+        </w:rPr>
+        <w:t xml:space="preserve"> These costs</w:t>
+      </w:r>
+      <w:r>
+        <w:rPr>
+          <w:color w:val="000000"/>
+        </w:rPr>
+        <w:t xml:space="preserve"> burden the scalability of Medtalk.</w:t>
+      </w:r>
+    </w:p>
+    <w:p>
+      <w:pPr>
+        <w:textAlignment w:val="baseline"/>
+        <w:rPr>
+          <w:color w:val="000000"/>
+        </w:rPr>
+      </w:pPr>
+    </w:p>
+    <w:p>
+      <w:pPr>
+        <w:textAlignment w:val="baseline"/>
+        <w:rPr>
+          <w:color w:val="000000"/>
+        </w:rPr>
+      </w:pPr>
+    </w:p>
+    <w:p>
+      <w:pPr>
+        <w:textAlignment w:val="baseline"/>
+        <w:rPr>
+          <w:color w:val="000000"/>
+        </w:rPr>
+      </w:pPr>
+      <w:r>
+        <w:rPr>
+          <w:color w:val="000000"/>
+        </w:rPr>
+        <w:t xml:space="preserve">Apart from the </w:t>
+      </w:r>
+      <w:r>
+        <w:rPr>
+          <w:color w:val="000000"/>
+        </w:rPr>
+        <w:t>financial burden</w:t>
+      </w:r>
+      <w:r>
+        <w:rPr>
+          <w:color w:val="000000"/>
+        </w:rPr>
+        <w:t xml:space="preserve"> on Faz Australia</w:t>
+      </w:r>
+      <w:r>
+        <w:rPr>
+          <w:color w:val="000000"/>
+        </w:rPr>
+        <w:t>, the main operational inefficiency is lack of a reusable safe tes</w:t>
+      </w:r>
+      <w:r>
+        <w:rPr>
+          <w:color w:val="000000"/>
+        </w:rPr>
+        <w:t xml:space="preserve">t environment. </w:t>
+      </w:r>
+      <w:r>
+        <w:rPr>
+          <w:color w:val="000000"/>
+        </w:rPr>
+        <w:t xml:space="preserve">The </w:t>
+      </w:r>
+      <w:r>
+        <w:rPr>
+          <w:color w:val="000000"/>
+        </w:rPr>
+        <w:t xml:space="preserve">restricted access to </w:t>
+      </w:r>
+      <w:r>
+        <w:rPr>
+          <w:color w:val="000000"/>
+        </w:rPr>
+        <w:t>sandbox</w:t>
+      </w:r>
+      <w:r>
+        <w:rPr>
+          <w:color w:val="000000"/>
+        </w:rPr>
+        <w:t xml:space="preserve">es slows development </w:t>
+      </w:r>
+      <w:r>
+        <w:rPr>
+          <w:color w:val="000000"/>
+        </w:rPr>
+        <w:t>and harder to reproduce issues consistently</w:t>
+      </w:r>
+      <w:r>
+        <w:rPr>
+          <w:color w:val="000000"/>
+        </w:rPr>
+        <w:t xml:space="preserve"> to improve MedTalk</w:t>
+      </w:r>
+      <w:r>
+        <w:rPr>
+          <w:color w:val="000000"/>
+        </w:rPr>
+        <w:t xml:space="preserve"> overall</w:t>
+      </w:r>
+      <w:r>
+        <w:rPr>
+          <w:color w:val="000000"/>
+        </w:rPr>
+        <w:t>.</w:t>
+      </w:r>
+      <w:r>
+        <w:rPr>
+          <w:color w:val="000000"/>
+        </w:rPr>
+        <w:t xml:space="preserve"> Due to strong privacy and compliance </w:t>
+      </w:r>
+      <w:r>
+        <w:rPr>
+          <w:color w:val="000000"/>
+        </w:rPr>
+        <w:t>requirements,</w:t>
+      </w:r>
+      <w:r>
+        <w:rPr>
+          <w:color w:val="000000"/>
+        </w:rPr>
+        <w:t xml:space="preserve"> </w:t>
+      </w:r>
+      <w:r>
+        <w:rPr>
+          <w:color w:val="000000"/>
+        </w:rPr>
+        <w:t>there is also limited flexibility in testing live connection</w:t>
+      </w:r>
+      <w:r>
+        <w:rPr>
+          <w:color w:val="000000"/>
+        </w:rPr>
+        <w:t xml:space="preserve"> with other BPs since </w:t>
+      </w:r>
+      <w:r>
+        <w:rPr>
+          <w:color w:val="000000"/>
+        </w:rPr>
+        <w:t xml:space="preserve">Epic requires the application to be load on first to test it. </w:t>
+      </w:r>
+      <w:r>
+        <w:rPr>
+          <w:color w:val="000000"/>
+        </w:rPr>
+        <w:t>These</w:t>
+      </w:r>
+      <w:r>
+        <w:rPr>
+          <w:color w:val="000000"/>
+        </w:rPr>
+        <w:t xml:space="preserve"> limitations clearly indicate the business pain on </w:t>
+      </w:r>
+      <w:r>
+        <w:rPr>
+          <w:color w:val="000000"/>
+        </w:rPr>
+        <w:t xml:space="preserve">high costs in expansion, </w:t>
+      </w:r>
+      <w:r>
+        <w:rPr>
+          <w:color w:val="000000"/>
+        </w:rPr>
+        <w:t xml:space="preserve">delayed integration tests and higher compliance exposure if problems are </w:t>
+      </w:r>
+      <w:r>
+        <w:rPr>
+          <w:color w:val="000000"/>
+        </w:rPr>
+        <w:t xml:space="preserve">found late. </w:t>
+      </w:r>
+      <w:r>
+        <w:rPr>
+          <w:color w:val="000000"/>
+        </w:rPr>
+        <w:t>These pain</w:t>
+      </w:r>
+      <w:r>
+        <w:rPr>
+          <w:color w:val="000000"/>
+        </w:rPr>
+        <w:t xml:space="preserve"> points are affecting</w:t>
+      </w:r>
+      <w:r>
+        <w:rPr>
+          <w:color w:val="000000"/>
+        </w:rPr>
+        <w:t xml:space="preserve"> engineering efficiency and confidence in releases</w:t>
+      </w:r>
+      <w:r>
+        <w:rPr>
+          <w:color w:val="000000"/>
+        </w:rPr>
+        <w:t xml:space="preserve">, which this project </w:t>
+      </w:r>
+      <w:r>
+        <w:rPr>
+          <w:color w:val="000000"/>
+        </w:rPr>
+        <w:t>of a test harness is designed to solve.</w:t>
+      </w:r>
+    </w:p>
+    <w:p>
+      <w:pPr>
+        <w:textAlignment w:val="baseline"/>
+        <w:rPr>
+          <w:color w:val="000000"/>
+        </w:rPr>
+      </w:pPr>
+      <w:r>
+        <w:rPr>
+          <w:noProof/>
+          <w:color w:val="000000"/>
+          <w14:ligatures w14:val="standardContextual"/>
+        </w:rPr>
+        <w:lastRenderedPageBreak/>
+        <w:drawing>
+          <wp:inline distT="0" distB="0" distL="0" distR="0" wp14:anchorId="51604F44" wp14:editId="4474326D">
+            <wp:extent cx="5731510" cy="3169920"/>
+            <wp:effectExtent l="0" t="0" r="2540" b="0"/>
+            <wp:docPr id="490604399" name="Picture 1"/>
+            <wp:cNvGraphicFramePr>
+              <a:graphicFrameLocks xmlns:a="http://schemas.openxmlformats.org/drawingml/2006/main" noChangeAspect="1"/>
+            </wp:cNvGraphicFramePr>
+            <a:graphic xmlns:a="http://schemas.openxmlformats.org/drawingml/2006/main">
+              <a:graphicData uri="http://schemas.openxmlformats.org/drawingml/2006/picture">
+                <pic:pic xmlns:pic="http://schemas.openxmlformats.org/drawingml/2006/picture">
+                  <pic:nvPicPr>
+                    <pic:cNvPr id="490604399" name="Picture 490604399"/>
+                    <pic:cNvPicPr/>
+                  </pic:nvPicPr>
+                  <pic:blipFill>
+                    <a:blip r:embed="rId4">
+                      <a:extLst>
+                        <a:ext uri="{28A0092B-C50C-407E-A947-70E740481C1C}">
+                          <a14:useLocalDpi xmlns:a14="http://schemas.microsoft.com/office/drawing/2010/main" val="0"/>
+                        </a:ext>
+                      </a:extLst>
+                    </a:blip>
+                    <a:stretch>
+                      <a:fillRect/>
+                    </a:stretch>
+                  </pic:blipFill>
+                  <pic:spPr>
+                    <a:xfrm>
+                      <a:off x="0" y="0"/>
+                      <a:ext cx="5731510" cy="3169920"/>
+                    </a:xfrm>
+                    <a:prstGeom prst="rect">
+                      <a:avLst/>
+                    </a:prstGeom>
+                  </pic:spPr>
+                </pic:pic>
+              </a:graphicData>
+            </a:graphic>
+          </wp:inline>
+        </w:drawing>
+      </w:r>
+    </w:p>
+    <w:p>
+      <w:pPr>
+        <w:textAlignment w:val="baseline"/>
+        <w:rPr>
+          <w:color w:val="000000"/>
+        </w:rPr>
+      </w:pPr>
+    </w:p>
+    <w:p>
+      <w:pPr>
+        <w:textAlignment w:val="baseline"/>
+        <w:rPr>
+          <w:color w:val="000000"/>
+        </w:rPr>
+      </w:pPr>
+      <w:r>
+        <w:rPr>
+          <w:color w:val="000000"/>
+        </w:rPr>
+        <w:t xml:space="preserve">I have diagram </w:t>
+      </w:r>
+    </w:p>
+    <w:p>
+      <w:pPr>
+        <w:textAlignment w:val="baseline"/>
+        <w:rPr>
+          <w:color w:val="000000"/>
+        </w:rPr>
+      </w:pPr>
+    </w:p>
+    <w:p>
+      <w:pPr>
+        <w:textAlignment w:val="baseline"/>
+        <w:rPr>
+          <w:lang w:val="en-US"/>
+        </w:rPr>
+      </w:pPr>
+      <w:r>
+        <w:rPr>
+          <w:lang w:val="en-US"/>
+        </w:rPr>
+        <w:t xml:space="preserve">3.2 Technology &amp; Market Survey  </w:t>
+      </w:r>
+    </w:p>
+    <w:p>
+      <w:pPr>
+        <w:textAlignment w:val="baseline"/>
+        <w:rPr>
+          <w:lang w:val="en-US"/>
+        </w:rPr>
+      </w:pPr>
+      <w:r>
+        <w:rPr>
+          <w:lang w:val="en-US"/>
+        </w:rPr>
+        <w:t xml:space="preserve">MedTalk </w:t>
+      </w:r>
+      <w:r>
+        <w:rPr>
+          <w:lang w:val="en-US"/>
+        </w:rPr>
+        <w:t>is part of</w:t>
+      </w:r>
+      <w:r>
+        <w:rPr>
+          <w:lang w:val="en-US"/>
+        </w:rPr>
+        <w:t xml:space="preserve"> the</w:t>
+      </w:r>
+      <w:r>
+        <w:rPr>
+          <w:lang w:val="en-US"/>
+        </w:rPr>
+        <w:t xml:space="preserve"> Australian health interoperability marke</w:t>
+      </w:r>
+      <w:r>
+        <w:rPr>
+          <w:lang w:val="en-US"/>
+        </w:rPr>
+        <w:t>t. T</w:t>
+      </w:r>
+      <w:r>
+        <w:rPr>
+          <w:lang w:val="en-US"/>
+        </w:rPr>
+        <w:t xml:space="preserve">he main technical challenge </w:t>
+      </w:r>
+      <w:r>
+        <w:rPr>
+          <w:lang w:val="en-US"/>
+        </w:rPr>
+        <w:t xml:space="preserve">in this market </w:t>
+      </w:r>
+      <w:r>
+        <w:rPr>
+          <w:lang w:val="en-US"/>
+        </w:rPr>
+        <w:t xml:space="preserve">is not only generating accurate clinical notes but safe exchange </w:t>
+      </w:r>
+      <w:r>
+        <w:rPr>
+          <w:lang w:val="en-US"/>
+        </w:rPr>
+        <w:t xml:space="preserve">of the clinical notes and correct </w:t>
+      </w:r>
+      <w:r>
+        <w:rPr>
+          <w:lang w:val="en-US"/>
+        </w:rPr>
+        <w:t>translation of</w:t>
+      </w:r>
+      <w:r>
+        <w:rPr>
+          <w:lang w:val="en-US"/>
+        </w:rPr>
+        <w:t xml:space="preserve"> the </w:t>
+      </w:r>
+      <w:r>
+        <w:rPr>
+          <w:lang w:val="en-US"/>
+        </w:rPr>
+        <w:t xml:space="preserve">data </w:t>
+      </w:r>
+      <w:r>
+        <w:rPr>
+          <w:lang w:val="en-US"/>
+        </w:rPr>
+        <w:t>to</w:t>
+      </w:r>
+      <w:r>
+        <w:rPr>
+          <w:lang w:val="en-US"/>
+        </w:rPr>
+        <w:t xml:space="preserve"> the</w:t>
+      </w:r>
+      <w:r>
+        <w:rPr>
+          <w:lang w:val="en-US"/>
+        </w:rPr>
+        <w:t xml:space="preserve"> receiving system. </w:t>
+      </w:r>
+      <w:r>
+        <w:rPr>
+          <w:lang w:val="en-US"/>
+        </w:rPr>
+        <w:t xml:space="preserve"> </w:t>
+      </w:r>
+      <w:r>
+        <w:rPr>
+          <w:lang w:val="en-US"/>
+        </w:rPr>
+        <w:t xml:space="preserve">The most </w:t>
+      </w:r>
+      <w:r>
+        <w:rPr>
+          <w:lang w:val="en-US"/>
+        </w:rPr>
+        <w:t xml:space="preserve">relevant technologies for the test harness are HL7 FHIR, </w:t>
+      </w:r>
+      <w:r>
+        <w:rPr>
+          <w:lang w:val="en-US"/>
+        </w:rPr>
+        <w:t>SMART</w:t>
+      </w:r>
+      <w:r>
+        <w:rPr>
+          <w:lang w:val="en-US"/>
+        </w:rPr>
         <w:t xml:space="preserve">, </w:t>
       </w:r>
       <w:r>
         <w:rPr>
-          <w:color w:val="000000"/>
-        </w:rPr>
-        <w:t>2026)</w:t>
-      </w:r>
-      <w:r>
-        <w:rPr>
-          <w:color w:val="000000"/>
+          <w:lang w:val="en-US"/>
+        </w:rPr>
+        <w:t>vendor integration layers</w:t>
+      </w:r>
+      <w:r>
+        <w:rPr>
+          <w:lang w:val="en-US"/>
+        </w:rPr>
+        <w:t xml:space="preserve"> and Australian clinical </w:t>
+      </w:r>
+      <w:r>
+        <w:rPr>
+          <w:lang w:val="en-US"/>
+        </w:rPr>
+        <w:t>terminology</w:t>
+      </w:r>
+      <w:r>
+        <w:rPr>
+          <w:lang w:val="en-US"/>
+        </w:rPr>
+        <w:t>.</w:t>
+      </w:r>
+      <w:r>
+        <w:rPr>
+          <w:lang w:val="en-US"/>
+        </w:rPr>
+        <w:t xml:space="preserve"> These are all essential for the project </w:t>
+      </w:r>
+      <w:r>
+        <w:rPr>
+          <w:lang w:val="en-US"/>
+        </w:rPr>
+        <w:t xml:space="preserve">as it </w:t>
+      </w:r>
+      <w:proofErr w:type="gramStart"/>
+      <w:r>
+        <w:rPr>
+          <w:lang w:val="en-US"/>
+        </w:rPr>
+        <w:t>has to</w:t>
+      </w:r>
+      <w:proofErr w:type="gramEnd"/>
+      <w:r>
+        <w:rPr>
+          <w:lang w:val="en-US"/>
+        </w:rPr>
+        <w:t xml:space="preserve"> reflect the same standards as production systems.</w:t>
+      </w:r>
+    </w:p>
+    <w:p>
+      <w:pPr>
+        <w:textAlignment w:val="baseline"/>
+        <w:rPr>
+          <w:lang w:val="en-US"/>
+        </w:rPr>
+      </w:pPr>
+    </w:p>
+    <w:p>
+      <w:pPr>
+        <w:textAlignment w:val="baseline"/>
+        <w:rPr>
+          <w:lang w:val="en-US"/>
+        </w:rPr>
+      </w:pPr>
+      <w:r>
+        <w:rPr>
+          <w:lang w:val="en-US"/>
+        </w:rPr>
+        <w:t xml:space="preserve">FHIR </w:t>
+      </w:r>
+      <w:r>
+        <w:rPr>
+          <w:lang w:val="en-US"/>
+        </w:rPr>
+        <w:t>(</w:t>
+      </w:r>
+      <w:r>
+        <w:rPr>
+          <w:color w:val="000000"/>
+        </w:rPr>
+        <w:t>Fast Healthcare Interoperability Resources</w:t>
+      </w:r>
+      <w:r>
+        <w:rPr>
+          <w:lang w:val="en-US"/>
+        </w:rPr>
+        <w:t xml:space="preserve">) is the central exchange </w:t>
+      </w:r>
+      <w:r>
+        <w:rPr>
+          <w:lang w:val="en-US"/>
+        </w:rPr>
+        <w:t>standard that defines resources meaning patient data</w:t>
+      </w:r>
+      <w:r>
+        <w:rPr>
+          <w:lang w:val="en-US"/>
+        </w:rPr>
+        <w:t xml:space="preserve">, appointments, clinical notes and related information structure and </w:t>
+      </w:r>
+      <w:r>
+        <w:rPr>
+          <w:lang w:val="en-US"/>
+        </w:rPr>
+        <w:t>transferred between systems</w:t>
+      </w:r>
+      <w:r>
+        <w:rPr>
+          <w:lang w:val="en-US"/>
+        </w:rPr>
+        <w:t xml:space="preserve"> </w:t>
+      </w:r>
+      <w:r>
+        <w:rPr>
+          <w:lang w:val="en-US"/>
+        </w:rPr>
+        <w:t>(</w:t>
+      </w:r>
+      <w:proofErr w:type="spellStart"/>
+      <w:r>
+        <w:rPr>
+          <w:color w:val="000000"/>
+        </w:rPr>
+        <w:t>eCQI</w:t>
+      </w:r>
+      <w:proofErr w:type="spellEnd"/>
+      <w:r>
+        <w:rPr>
+          <w:color w:val="000000"/>
+        </w:rPr>
+        <w:t xml:space="preserve">, </w:t>
+      </w:r>
+      <w:r>
+        <w:rPr>
+          <w:color w:val="000000"/>
+        </w:rPr>
+        <w:t>2025)</w:t>
+      </w:r>
+      <w:r>
+        <w:rPr>
+          <w:lang w:val="en-US"/>
+        </w:rPr>
+        <w:t>.</w:t>
+      </w:r>
+      <w:r>
+        <w:rPr>
+          <w:lang w:val="en-US"/>
+        </w:rPr>
+        <w:t xml:space="preserve"> It also </w:t>
+      </w:r>
+      <w:r>
+        <w:rPr>
+          <w:lang w:val="en-US"/>
+        </w:rPr>
+        <w:t xml:space="preserve">depicts </w:t>
+      </w:r>
+      <w:r>
+        <w:rPr>
+          <w:lang w:val="en-US"/>
+        </w:rPr>
+        <w:t>interaction patterns including real time representation state Transfer (RESTful)</w:t>
+      </w:r>
+      <w:r>
+        <w:rPr>
+          <w:lang w:val="en-US"/>
+        </w:rPr>
+        <w:t xml:space="preserve"> </w:t>
+      </w:r>
+      <w:r>
+        <w:rPr>
+          <w:lang w:val="en-US"/>
+        </w:rPr>
+        <w:t xml:space="preserve">application programming interfaces (APIs), </w:t>
+      </w:r>
+      <w:r>
+        <w:rPr>
+          <w:lang w:val="en-US"/>
+        </w:rPr>
+        <w:t xml:space="preserve">document based and messaging. </w:t>
+      </w:r>
+      <w:r>
+        <w:rPr>
+          <w:lang w:val="en-US"/>
+        </w:rPr>
+        <w:t>Th</w:t>
+      </w:r>
+      <w:r>
+        <w:rPr>
+          <w:lang w:val="en-US"/>
+        </w:rPr>
+        <w:t xml:space="preserve">e RESTful APIS use </w:t>
+      </w:r>
+      <w:r>
+        <w:rPr>
+          <w:lang w:val="en-US"/>
+        </w:rPr>
+        <w:t>HTTP</w:t>
+      </w:r>
+      <w:r>
+        <w:rPr>
+          <w:lang w:val="en-US"/>
+        </w:rPr>
+        <w:t xml:space="preserve"> operations to create, read, update and search for FHIR resources to enable real time </w:t>
+      </w:r>
+      <w:r>
+        <w:rPr>
+          <w:lang w:val="en-US"/>
+        </w:rPr>
+        <w:t xml:space="preserve">data exchange. </w:t>
+      </w:r>
+      <w:r>
+        <w:rPr>
+          <w:lang w:val="en-US"/>
+        </w:rPr>
+        <w:t>FHIR</w:t>
+      </w:r>
+      <w:r>
+        <w:rPr>
+          <w:lang w:val="en-US"/>
+        </w:rPr>
+        <w:t xml:space="preserve"> framework</w:t>
+      </w:r>
+      <w:r>
+        <w:rPr>
+          <w:lang w:val="en-US"/>
+        </w:rPr>
+        <w:t xml:space="preserve"> is </w:t>
+      </w:r>
+      <w:r>
+        <w:rPr>
+          <w:lang w:val="en-US"/>
+        </w:rPr>
+        <w:t xml:space="preserve">free to build commercial and </w:t>
+      </w:r>
+      <w:r>
+        <w:rPr>
+          <w:lang w:val="en-US"/>
+        </w:rPr>
+        <w:t>open-source</w:t>
+      </w:r>
+      <w:r>
+        <w:rPr>
+          <w:lang w:val="en-US"/>
+        </w:rPr>
+        <w:t xml:space="preserve"> tools</w:t>
+      </w:r>
+      <w:r>
+        <w:rPr>
+          <w:lang w:val="en-US"/>
+        </w:rPr>
+        <w:t xml:space="preserve"> while </w:t>
+      </w:r>
+      <w:r>
+        <w:rPr>
+          <w:lang w:val="en-US"/>
+        </w:rPr>
+        <w:t>HL7</w:t>
+      </w:r>
+      <w:r>
+        <w:rPr>
+          <w:lang w:val="en-US"/>
+        </w:rPr>
+        <w:t xml:space="preserve"> </w:t>
+      </w:r>
+      <w:r>
+        <w:rPr>
+          <w:lang w:val="en-US"/>
+        </w:rPr>
+        <w:t xml:space="preserve">is registered trademark that </w:t>
+      </w:r>
+      <w:r>
+        <w:rPr>
+          <w:lang w:val="en-US"/>
+        </w:rPr>
+        <w:t>cannot</w:t>
+      </w:r>
+      <w:r>
+        <w:rPr>
+          <w:lang w:val="en-US"/>
+        </w:rPr>
+        <w:t xml:space="preserve"> be used without permission. </w:t>
+      </w:r>
+      <w:r>
+        <w:rPr>
+          <w:lang w:val="en-US"/>
+        </w:rPr>
+        <w:t xml:space="preserve">FHIR is a necessity for the project to </w:t>
+      </w:r>
+      <w:r>
+        <w:rPr>
+          <w:lang w:val="en-US"/>
+        </w:rPr>
+        <w:t xml:space="preserve">mimic structured clinical document exchange </w:t>
+      </w:r>
+      <w:r>
+        <w:rPr>
+          <w:lang w:val="en-US"/>
+        </w:rPr>
+        <w:t>and</w:t>
+      </w:r>
+      <w:r>
+        <w:rPr>
+          <w:lang w:val="en-US"/>
+        </w:rPr>
+        <w:t xml:space="preserve"> be able to test </w:t>
+      </w:r>
+      <w:r>
+        <w:rPr>
+          <w:lang w:val="en-US"/>
+        </w:rPr>
+        <w:t>it.</w:t>
+      </w:r>
+    </w:p>
+    <w:p>
+      <w:pPr>
+        <w:textAlignment w:val="baseline"/>
+        <w:rPr>
+          <w:lang w:val="en-US"/>
+        </w:rPr>
+      </w:pPr>
+    </w:p>
+    <w:p>
+      <w:pPr>
+        <w:textAlignment w:val="baseline"/>
+        <w:rPr>
+          <w:lang w:val="en-US"/>
+        </w:rPr>
+      </w:pPr>
+      <w:r>
+        <w:rPr>
+          <w:lang w:val="en-US"/>
+        </w:rPr>
+        <w:t xml:space="preserve">Australian </w:t>
+      </w:r>
+      <w:r>
+        <w:rPr>
+          <w:lang w:val="en-US"/>
+        </w:rPr>
+        <w:t>clinical terminology</w:t>
+      </w:r>
+      <w:r>
+        <w:rPr>
+          <w:lang w:val="en-US"/>
+        </w:rPr>
+        <w:t xml:space="preserve"> and classification</w:t>
+      </w:r>
+      <w:r>
+        <w:rPr>
+          <w:lang w:val="en-US"/>
+        </w:rPr>
+        <w:t xml:space="preserve"> is vital which include SNOMED CT-AU</w:t>
+      </w:r>
+      <w:r>
+        <w:rPr>
+          <w:lang w:val="en-US"/>
+        </w:rPr>
+        <w:t xml:space="preserve"> and ICD-10-AM</w:t>
+      </w:r>
+      <w:r>
+        <w:rPr>
+          <w:lang w:val="en-US"/>
         </w:rPr>
         <w:t xml:space="preserve">. </w:t>
       </w:r>
       <w:r>
         <w:rPr>
-          <w:color w:val="000000"/>
-        </w:rPr>
-        <w:t>MedTalk and MediBetter partnership</w:t>
-      </w:r>
-      <w:r>
-        <w:rPr>
-          <w:color w:val="000000"/>
-        </w:rPr>
-        <w:t xml:space="preserve"> tech-tech</w:t>
-      </w:r>
-      <w:r>
-        <w:rPr>
-          <w:color w:val="000000"/>
-        </w:rPr>
-        <w:t xml:space="preserve"> API</w:t>
-      </w:r>
-      <w:r>
-        <w:rPr>
-          <w:color w:val="000000"/>
-        </w:rPr>
-        <w:t xml:space="preserve"> prices</w:t>
-      </w:r>
-      <w:r>
-        <w:rPr>
-          <w:color w:val="000000"/>
+          <w:lang w:val="en-US"/>
+        </w:rPr>
+        <w:t>SNOMED CT-AU</w:t>
+      </w:r>
+      <w:r>
+        <w:rPr>
+          <w:lang w:val="en-US"/>
+        </w:rPr>
+        <w:t xml:space="preserve"> is the preferred clinical terminology</w:t>
+      </w:r>
+      <w:r>
+        <w:rPr>
+          <w:lang w:val="en-US"/>
         </w:rPr>
         <w:t xml:space="preserve"> </w:t>
       </w:r>
       <w:r>
         <w:rPr>
-          <w:color w:val="000000"/>
-        </w:rPr>
-        <w:t>are not</w:t>
-      </w:r>
-      <w:r>
-        <w:rPr>
-          <w:color w:val="000000"/>
-        </w:rPr>
-        <w:t xml:space="preserve"> publicly </w:t>
-      </w:r>
-      <w:r>
-        <w:rPr>
-          <w:color w:val="000000"/>
-        </w:rPr>
-        <w:t>available</w:t>
-      </w:r>
-      <w:r>
-        <w:rPr>
-          <w:color w:val="000000"/>
-        </w:rPr>
-        <w:t xml:space="preserve"> but according </w:t>
-      </w:r>
-      <w:r>
-        <w:rPr>
-          <w:color w:val="000000"/>
-        </w:rPr>
-        <w:t>to MarkiTech.AI</w:t>
-      </w:r>
-      <w:r>
-        <w:rPr>
-          <w:color w:val="000000"/>
-        </w:rPr>
-        <w:t xml:space="preserve"> (2025</w:t>
-      </w:r>
-      <w:r>
-        <w:rPr>
-          <w:color w:val="000000"/>
-        </w:rPr>
-        <w:t>)</w:t>
-      </w:r>
-      <w:r>
-        <w:rPr>
-          <w:color w:val="000000"/>
-        </w:rPr>
-        <w:t>,</w:t>
-      </w:r>
-      <w:r>
-        <w:rPr>
-          <w:color w:val="000000"/>
-        </w:rPr>
-        <w:t xml:space="preserve"> a</w:t>
-      </w:r>
-      <w:r>
-        <w:rPr>
-          <w:color w:val="000000"/>
-        </w:rPr>
-        <w:t xml:space="preserve"> flat fee </w:t>
-      </w:r>
-      <w:r>
-        <w:rPr>
-          <w:color w:val="000000"/>
-        </w:rPr>
-        <w:t>ranges</w:t>
-      </w:r>
-      <w:r>
-        <w:rPr>
-          <w:color w:val="000000"/>
-        </w:rPr>
-        <w:t xml:space="preserve"> from $100 to $500</w:t>
-      </w:r>
-      <w:r>
-        <w:rPr>
-          <w:color w:val="000000"/>
-        </w:rPr>
-        <w:t>. This ex</w:t>
-      </w:r>
-      <w:r>
-        <w:rPr>
-          <w:color w:val="000000"/>
-        </w:rPr>
-        <w:t xml:space="preserve">cludes the </w:t>
-      </w:r>
-      <w:r>
-        <w:rPr>
-          <w:color w:val="000000"/>
-        </w:rPr>
-        <w:t xml:space="preserve">subscription of the MediBetter professional suite which </w:t>
-      </w:r>
-      <w:r>
-        <w:rPr>
-          <w:color w:val="000000"/>
-        </w:rPr>
-        <w:t>unlocks the BOSS engine and browser extensions for clinical workflow.</w:t>
-      </w:r>
-      <w:r>
-        <w:rPr>
-          <w:color w:val="000000"/>
-        </w:rPr>
+          <w:lang w:val="en-US"/>
+        </w:rPr>
+        <w:t>in Australia</w:t>
+      </w:r>
+      <w:r>
+        <w:rPr>
+          <w:lang w:val="en-US"/>
+        </w:rPr>
+        <w:t xml:space="preserve"> which is an extension of the global </w:t>
+      </w:r>
+      <w:r>
+        <w:t xml:space="preserve">SNOMED </w:t>
+      </w:r>
+      <w:r>
+        <w:t>CT standard.</w:t>
+      </w:r>
+      <w:r>
+        <w:t xml:space="preserve"> It combines international core clinical data with Australian-specific terms, spellings, local reference set</w:t>
+      </w:r>
+      <w:r>
+        <w:t>s</w:t>
+      </w:r>
+      <w:r>
+        <w:t xml:space="preserve"> and the Australian Medicines Terminology (AMT</w:t>
+      </w:r>
+      <w:r>
+        <w:t xml:space="preserve">). </w:t>
+      </w:r>
+      <w:r>
+        <w:rPr>
+          <w:lang w:val="en-US"/>
+        </w:rPr>
+        <w:t xml:space="preserve">SNOMED CT-AU </w:t>
+      </w:r>
+      <w:r>
+        <w:t>c</w:t>
+      </w:r>
+      <w:r>
+        <w:t xml:space="preserve">ontains </w:t>
+      </w:r>
+      <w:r>
+        <w:t xml:space="preserve">numerous </w:t>
+      </w:r>
+      <w:r>
+        <w:t xml:space="preserve">clinical concepts organized into hierarchies </w:t>
+      </w:r>
+      <w:r>
+        <w:t>like body structures, procedures</w:t>
+      </w:r>
+      <w:r>
         <w:t xml:space="preserve"> </w:t>
       </w:r>
       <w:r>
-        <w:rPr>
-          <w:color w:val="000000"/>
-        </w:rPr>
-        <w:t xml:space="preserve">These integration and subscription costs represent a significant financial pain point for </w:t>
-      </w:r>
-      <w:r>
-        <w:rPr>
-          <w:color w:val="000000"/>
-        </w:rPr>
-        <w:t xml:space="preserve">MedTalk, focusing </w:t>
-      </w:r>
-      <w:r>
-        <w:rPr>
-          <w:color w:val="000000"/>
-        </w:rPr>
-        <w:t>on the high upfront investment required for full bidirectional FHIR integration with Epic.</w:t>
-      </w:r>
-      <w:r>
-        <w:rPr>
-          <w:color w:val="000000"/>
-        </w:rPr>
-        <w:t xml:space="preserve"> These costs</w:t>
-      </w:r>
-      <w:r>
-        <w:rPr>
-          <w:color w:val="000000"/>
-        </w:rPr>
-        <w:t xml:space="preserve"> burden the scalability of Medtalk.</w:t>
-      </w:r>
-    </w:p>
-    <w:p>
-      <w:pPr>
-        <w:textAlignment w:val="baseline"/>
-        <w:rPr>
-          <w:color w:val="000000"/>
-        </w:rPr>
-      </w:pPr>
-    </w:p>
-    <w:p>
-      <w:pPr>
-        <w:textAlignment w:val="baseline"/>
-        <w:rPr>
-          <w:color w:val="000000"/>
-        </w:rPr>
-      </w:pPr>
-    </w:p>
-    <w:p>
-      <w:pPr>
-        <w:textAlignment w:val="baseline"/>
-        <w:rPr>
-          <w:color w:val="000000"/>
-        </w:rPr>
-      </w:pPr>
-      <w:r>
-        <w:rPr>
-          <w:color w:val="000000"/>
-        </w:rPr>
-        <w:t xml:space="preserve">Apart from the </w:t>
-      </w:r>
-      <w:r>
-        <w:rPr>
-          <w:color w:val="000000"/>
-        </w:rPr>
-        <w:t>financial burden</w:t>
-      </w:r>
-      <w:r>
-        <w:rPr>
-          <w:color w:val="000000"/>
-        </w:rPr>
-        <w:t xml:space="preserve"> on Faz Australia</w:t>
-      </w:r>
-      <w:r>
-        <w:rPr>
-          <w:color w:val="000000"/>
-        </w:rPr>
-        <w:t>, the main operational inefficiency is lack of a reusable safe tes</w:t>
-      </w:r>
-      <w:r>
-        <w:rPr>
-          <w:color w:val="000000"/>
-        </w:rPr>
-        <w:t xml:space="preserve">t environment. </w:t>
-      </w:r>
-      <w:r>
-        <w:rPr>
-          <w:color w:val="000000"/>
-        </w:rPr>
-        <w:t xml:space="preserve">The </w:t>
-      </w:r>
-      <w:r>
-        <w:rPr>
-          <w:color w:val="000000"/>
-        </w:rPr>
-        <w:t xml:space="preserve">restricted access to </w:t>
-      </w:r>
-      <w:r>
-        <w:rPr>
-          <w:color w:val="000000"/>
-        </w:rPr>
-        <w:t>sandbox</w:t>
-      </w:r>
-      <w:r>
-        <w:rPr>
-          <w:color w:val="000000"/>
-        </w:rPr>
-        <w:t xml:space="preserve">es slows development </w:t>
-      </w:r>
-      <w:r>
-        <w:rPr>
-          <w:color w:val="000000"/>
-        </w:rPr>
-        <w:t>and harder to reproduce issues consistently</w:t>
-      </w:r>
-      <w:r>
-        <w:rPr>
-          <w:color w:val="000000"/>
-        </w:rPr>
-        <w:t xml:space="preserve"> to improve MedTalk</w:t>
-      </w:r>
-      <w:r>
-        <w:rPr>
-          <w:color w:val="000000"/>
-        </w:rPr>
-        <w:t xml:space="preserve"> overall</w:t>
-      </w:r>
-      <w:r>
-        <w:rPr>
-          <w:color w:val="000000"/>
-        </w:rPr>
+        <w:t>and clinical findings</w:t>
+      </w:r>
+      <w:r>
         <w:t>.</w:t>
       </w:r>
       <w:r>
-        <w:rPr>
-          <w:color w:val="000000"/>
-        </w:rPr>
-        <w:t xml:space="preserve"> Due to strong privacy and compliance </w:t>
-      </w:r>
-      <w:r>
-        <w:rPr>
-          <w:color w:val="000000"/>
-        </w:rPr>
-        <w:t>requirements,</w:t>
-      </w:r>
-      <w:r>
-        <w:rPr>
-          <w:color w:val="000000"/>
-        </w:rPr>
         <w:t xml:space="preserve"> </w:t>
       </w:r>
       <w:r>
         <w:rPr>
-          <w:color w:val="000000"/>
-        </w:rPr>
-        <w:t>there is also limited flexibility in testing live connection</w:t>
-      </w:r>
-      <w:r>
-        <w:rPr>
-          <w:color w:val="000000"/>
-        </w:rPr>
-        <w:t xml:space="preserve"> with other BPs since </w:t>
-      </w:r>
-      <w:r>
-        <w:rPr>
-          <w:color w:val="000000"/>
-        </w:rPr>
-        <w:t xml:space="preserve">Epic requires the application to be load on first to test it. </w:t>
-      </w:r>
-      <w:r>
-        <w:rPr>
-          <w:color w:val="000000"/>
-        </w:rPr>
-        <w:t>These</w:t>
-      </w:r>
-      <w:r>
-        <w:rPr>
-          <w:color w:val="000000"/>
-        </w:rPr>
-        <w:t xml:space="preserve"> limitations clearly indicate the business pain on </w:t>
-      </w:r>
-      <w:r>
-        <w:rPr>
-          <w:color w:val="000000"/>
-        </w:rPr>
-        <w:t xml:space="preserve">high costs in expansion, </w:t>
-      </w:r>
-      <w:r>
-        <w:rPr>
-          <w:color w:val="000000"/>
-        </w:rPr>
-        <w:t xml:space="preserve">delayed integration tests and higher compliance exposure if problems are </w:t>
-      </w:r>
-      <w:r>
-        <w:rPr>
-          <w:color w:val="000000"/>
-        </w:rPr>
-        <w:t xml:space="preserve">found late. </w:t>
-      </w:r>
-      <w:r>
-        <w:rPr>
-          <w:color w:val="000000"/>
-        </w:rPr>
-        <w:t>These pain</w:t>
-      </w:r>
-      <w:r>
-        <w:rPr>
-          <w:color w:val="000000"/>
-        </w:rPr>
-        <w:t xml:space="preserve"> points are affecting</w:t>
-      </w:r>
-      <w:r>
-        <w:rPr>
-          <w:color w:val="000000"/>
-        </w:rPr>
-        <w:t xml:space="preserve"> engineering efficiency and confidence in releases</w:t>
-      </w:r>
-      <w:r>
-        <w:rPr>
-          <w:color w:val="000000"/>
-        </w:rPr>
-        <w:t xml:space="preserve">, which this project </w:t>
-      </w:r>
-      <w:r>
-        <w:rPr>
-          <w:color w:val="000000"/>
-        </w:rPr>
-        <w:t>of a test harness is designed to solve.</w:t>
-      </w:r>
-    </w:p>
-    <w:p>
-      <w:pPr>
-        <w:textAlignment w:val="baseline"/>
-        <w:rPr>
-          <w:color w:val="000000"/>
-        </w:rPr>
-      </w:pPr>
-    </w:p>
-    <w:p>
-      <w:pPr>
-        <w:textAlignment w:val="baseline"/>
-        <w:rPr>
-          <w:color w:val="000000"/>
-        </w:rPr>
-      </w:pPr>
-    </w:p>
-    <w:p>
-      <w:pPr>
-        <w:textAlignment w:val="baseline"/>
-        <w:rPr>
-          <w:color w:val="000000"/>
-        </w:rPr>
-      </w:pPr>
-    </w:p>
-    <w:p>
-      <w:pPr>
-        <w:textAlignment w:val="baseline"/>
-        <w:rPr>
-          <w:lang w:val="en-US"/>
-        </w:rPr>
-      </w:pPr>
-      <w:r>
-        <w:rPr>
-          <w:lang w:val="en-US"/>
-        </w:rPr>
-        <w:t>3.2 Technology</w:t>
-      </w:r>
-      <w:r>
-        <w:rPr>
-          <w:lang w:val="en-US"/>
-        </w:rPr>
-        <w:t xml:space="preserve"> &amp; Market Survey  </w:t>
-      </w:r>
-    </w:p>
-    <w:p>
-      <w:pPr>
-        <w:textAlignment w:val="baseline"/>
-        <w:rPr>
-          <w:lang w:val="en-US"/>
-        </w:rPr>
-      </w:pPr>
-      <w:r>
-        <w:rPr>
-          <w:lang w:val="en-US"/>
-        </w:rPr>
-        <w:t xml:space="preserve">MedTalk </w:t>
-      </w:r>
-      <w:r>
-        <w:rPr>
-          <w:lang w:val="en-US"/>
-        </w:rPr>
-        <w:t>is part of</w:t>
-      </w:r>
-      <w:r>
-        <w:rPr>
-          <w:lang w:val="en-US"/>
-        </w:rPr>
-        <w:t xml:space="preserve"> the</w:t>
-      </w:r>
-      <w:r>
-        <w:rPr>
-          <w:lang w:val="en-US"/>
-        </w:rPr>
-        <w:t xml:space="preserve"> Australian health interoperability marke</w:t>
-      </w:r>
-      <w:r>
-        <w:rPr>
-          <w:lang w:val="en-US"/>
-        </w:rPr>
-        <w:t>t. T</w:t>
-      </w:r>
-      <w:r>
-        <w:rPr>
-          <w:lang w:val="en-US"/>
-        </w:rPr>
-        <w:t xml:space="preserve">he main technical challenge </w:t>
-      </w:r>
-      <w:r>
-        <w:rPr>
-          <w:lang w:val="en-US"/>
-        </w:rPr>
-        <w:t xml:space="preserve">in this market </w:t>
-      </w:r>
-      <w:r>
-        <w:rPr>
-          <w:lang w:val="en-US"/>
-        </w:rPr>
-        <w:t xml:space="preserve">is not only generating accurate clinical notes but safe exchange </w:t>
-      </w:r>
-      <w:r>
-        <w:rPr>
-          <w:lang w:val="en-US"/>
-        </w:rPr>
-        <w:t xml:space="preserve">of </w:t>
-      </w:r>
-      <w:r>
-        <w:rPr>
-          <w:lang w:val="en-US"/>
-        </w:rPr>
-        <w:lastRenderedPageBreak/>
-        <w:t xml:space="preserve">the clinical notes and correct </w:t>
-      </w:r>
-      <w:r>
-        <w:rPr>
-          <w:lang w:val="en-US"/>
-        </w:rPr>
-        <w:t>translation of</w:t>
-      </w:r>
-      <w:r>
-        <w:rPr>
-          <w:lang w:val="en-US"/>
-        </w:rPr>
-        <w:t xml:space="preserve"> the </w:t>
-      </w:r>
-      <w:r>
-        <w:rPr>
-          <w:lang w:val="en-US"/>
-        </w:rPr>
-        <w:t xml:space="preserve">data </w:t>
-      </w:r>
-      <w:r>
-        <w:rPr>
-          <w:lang w:val="en-US"/>
-        </w:rPr>
-        <w:t>to</w:t>
-      </w:r>
-      <w:r>
-        <w:rPr>
-          <w:lang w:val="en-US"/>
-        </w:rPr>
-        <w:t xml:space="preserve"> the</w:t>
-      </w:r>
-      <w:r>
-        <w:rPr>
-          <w:lang w:val="en-US"/>
-        </w:rPr>
-        <w:t xml:space="preserve"> receiving system. </w:t>
+          <w:lang w:val="en-US"/>
+        </w:rPr>
+        <w:t>SNOMED CT-AU is then mapped to ICD-10-AM</w:t>
       </w:r>
       <w:r>
         <w:rPr>
@@ -1167,43 +1694,316 @@
         <w:rPr>
           <w:lang w:val="en-US"/>
         </w:rPr>
-        <w:t xml:space="preserve">The most </w:t>
-      </w:r>
-      <w:r>
-        <w:rPr>
-          <w:lang w:val="en-US"/>
-        </w:rPr>
-        <w:t xml:space="preserve">relevant technologies for the test harness are HL7 FHIR, </w:t>
-      </w:r>
-      <w:r>
-        <w:rPr>
-          <w:lang w:val="en-US"/>
-        </w:rPr>
-        <w:t>SMART</w:t>
-      </w:r>
-      <w:r>
-        <w:rPr>
-          <w:lang w:val="en-US"/>
-        </w:rPr>
+        <w:t xml:space="preserve">which is </w:t>
+      </w:r>
+      <w:r>
+        <w:rPr>
+          <w:lang w:val="en-US"/>
+        </w:rPr>
+        <w:t>classification of diseases and diagnosis</w:t>
+      </w:r>
+      <w:r>
+        <w:t xml:space="preserve"> </w:t>
+      </w:r>
+      <w:r>
+        <w:t>t</w:t>
+      </w:r>
+      <w:r>
+        <w:t>ailored to match Australian clinical terminology, practice and health-tracking need</w:t>
+      </w:r>
+      <w:r>
+        <w:t xml:space="preserve">. The </w:t>
+      </w:r>
+      <w:r>
+        <w:rPr>
+          <w:lang w:val="en-US"/>
+        </w:rPr>
+        <w:t xml:space="preserve">ICD-10-AM is mapped to MBS for billing in Australia. These terms need to be </w:t>
+      </w:r>
+      <w:r>
+        <w:rPr>
+          <w:lang w:val="en-US"/>
+        </w:rPr>
+        <w:t>coded</w:t>
+      </w:r>
+      <w:r>
+        <w:rPr>
+          <w:lang w:val="en-US"/>
+        </w:rPr>
+        <w:t xml:space="preserve"> </w:t>
+      </w:r>
+      <w:r>
+        <w:rPr>
+          <w:lang w:val="en-US"/>
+        </w:rPr>
+        <w:t xml:space="preserve">in the synthetic patient record </w:t>
+      </w:r>
+      <w:r>
+        <w:rPr>
+          <w:lang w:val="en-US"/>
+        </w:rPr>
+        <w:t xml:space="preserve">correctly as the test harness will </w:t>
+      </w:r>
+      <w:r>
+        <w:rPr>
+          <w:lang w:val="en-US"/>
+        </w:rPr>
+        <w:t>validate them.</w:t>
+      </w:r>
+      <w:r>
+        <w:rPr>
+          <w:lang w:val="en-US"/>
+        </w:rPr>
+        <w:t xml:space="preserve"> </w:t>
+      </w:r>
+      <w:r>
+        <w:rPr>
+          <w:lang w:val="en-US"/>
+        </w:rPr>
+        <w:t>These terminologies</w:t>
+      </w:r>
+      <w:r>
+        <w:rPr>
+          <w:lang w:val="en-US"/>
+        </w:rPr>
+        <w:t xml:space="preserve"> </w:t>
+      </w:r>
+      <w:r>
+        <w:rPr>
+          <w:lang w:val="en-US"/>
+        </w:rPr>
+        <w:t>are free access to code in synthetic data.</w:t>
+      </w:r>
+    </w:p>
+    <w:p>
+      <w:pPr>
+        <w:textAlignment w:val="baseline"/>
+        <w:rPr>
+          <w:lang w:val="en-US"/>
+        </w:rPr>
+      </w:pPr>
+    </w:p>
+    <w:p>
+      <w:pPr>
+        <w:textAlignment w:val="baseline"/>
+        <w:rPr>
+          <w:lang w:val="en-US"/>
+        </w:rPr>
+      </w:pPr>
+      <w:r>
+        <w:rPr>
+          <w:lang w:val="en-US"/>
+        </w:rPr>
+        <w:t xml:space="preserve">Synthea is currently one of the </w:t>
+      </w:r>
+      <w:r>
+        <w:rPr>
+          <w:lang w:val="en-US"/>
+        </w:rPr>
+        <w:t xml:space="preserve">most </w:t>
+      </w:r>
+      <w:r>
+        <w:rPr>
+          <w:lang w:val="en-US"/>
+        </w:rPr>
+        <w:t>credited</w:t>
+      </w:r>
+      <w:r>
+        <w:rPr>
+          <w:lang w:val="en-US"/>
+        </w:rPr>
+        <w:t xml:space="preserve"> synthetic </w:t>
+      </w:r>
+      <w:r>
+        <w:rPr>
+          <w:lang w:val="en-US"/>
+        </w:rPr>
+        <w:t xml:space="preserve">patient </w:t>
+      </w:r>
+      <w:proofErr w:type="gramStart"/>
+      <w:r>
+        <w:rPr>
+          <w:lang w:val="en-US"/>
+        </w:rPr>
+        <w:t>generator</w:t>
+      </w:r>
+      <w:proofErr w:type="gramEnd"/>
+      <w:r>
+        <w:rPr>
+          <w:lang w:val="en-US"/>
+        </w:rPr>
+        <w:t xml:space="preserve"> as it creates </w:t>
+      </w:r>
+      <w:r>
+        <w:rPr>
+          <w:lang w:val="en-US"/>
+        </w:rPr>
+        <w:t>realistic</w:t>
+      </w:r>
+      <w:r>
+        <w:rPr>
+          <w:lang w:val="en-US"/>
+        </w:rPr>
+        <w:t xml:space="preserve"> </w:t>
+      </w:r>
+      <w:r>
+        <w:t>realistic mock medical histories and electronic health records</w:t>
+      </w:r>
+      <w:r>
+        <w:t xml:space="preserve"> lifespan</w:t>
+      </w:r>
+      <w:r>
+        <w:t xml:space="preserve"> from birth to death.</w:t>
+      </w:r>
+      <w:r>
+        <w:t xml:space="preserve"> </w:t>
+      </w:r>
+      <w:r>
+        <w:t xml:space="preserve">Synthea is an open source but produces </w:t>
+      </w:r>
+      <w:r>
+        <w:t xml:space="preserve">mock patients based on Unites States of America demographics. </w:t>
+      </w:r>
+      <w:r>
+        <w:t xml:space="preserve">CSIRO have created Australian mock data using Australian </w:t>
+      </w:r>
+      <w:r>
+        <w:t>demographics,</w:t>
+      </w:r>
+      <w:r>
+        <w:t xml:space="preserve"> </w:t>
+      </w:r>
+      <w:r>
+        <w:t xml:space="preserve">but the </w:t>
+      </w:r>
+      <w:r>
+        <w:t xml:space="preserve">synthea </w:t>
+      </w:r>
+      <w:r>
+        <w:t>tool is not available for public</w:t>
+      </w:r>
+      <w:r>
+        <w:t>.</w:t>
+      </w:r>
+      <w:r>
+        <w:t xml:space="preserve"> </w:t>
+      </w:r>
+      <w:r>
+        <w:t>T</w:t>
+      </w:r>
+      <w:r>
+        <w:t>he mock data is available</w:t>
+      </w:r>
+      <w:r>
+        <w:t xml:space="preserve"> which would be used for this project to ensure compliance and </w:t>
+      </w:r>
+      <w:r>
+        <w:t>mimics</w:t>
+      </w:r>
+      <w:r>
+        <w:t xml:space="preserve"> real</w:t>
+      </w:r>
+      <w:r>
+        <w:t xml:space="preserve"> </w:t>
+      </w:r>
+      <w:r>
+        <w:t>clinical system.</w:t>
+      </w:r>
+      <w:r>
+        <w:t xml:space="preserve"> SMART </w:t>
+      </w:r>
+      <w:r>
+        <w:t xml:space="preserve">on FHIR </w:t>
+      </w:r>
+      <w:r>
+        <w:t xml:space="preserve">is the </w:t>
+      </w:r>
+      <w:r>
+        <w:t xml:space="preserve">authentication and authorising </w:t>
+      </w:r>
+      <w:r>
+        <w:t>secure system that lets third-party health apps log users in</w:t>
+      </w:r>
+      <w:r>
         <w:t xml:space="preserve">, </w:t>
       </w:r>
       <w:r>
-        <w:rPr>
-          <w:lang w:val="en-US"/>
-        </w:rPr>
-        <w:t>vendor integration layers</w:t>
-      </w:r>
-      <w:r>
-        <w:rPr>
-          <w:lang w:val="en-US"/>
-        </w:rPr>
-        <w:t xml:space="preserve"> and Australian clinical </w:t>
-      </w:r>
-      <w:r>
-        <w:rPr>
-          <w:lang w:val="en-US"/>
-        </w:rPr>
-        <w:t>terminology</w:t>
+        <w:t>access electronic health record (EHR) data using standard OAuth 2.0 protocols</w:t>
+      </w:r>
+      <w:r>
+        <w:t xml:space="preserve">. </w:t>
+      </w:r>
+      <w:r>
+        <w:t>This security is necessary to ensure that there is no authorised access to the Test harness.</w:t>
+      </w:r>
+    </w:p>
+    <w:p>
+      <w:pPr>
+        <w:textAlignment w:val="baseline"/>
+        <w:rPr>
+          <w:lang w:val="en-US"/>
+        </w:rPr>
+      </w:pPr>
+    </w:p>
+    <w:p>
+      <w:pPr>
+        <w:textAlignment w:val="baseline"/>
+        <w:rPr>
+          <w:lang w:val="en-US"/>
+        </w:rPr>
+      </w:pPr>
+    </w:p>
+    <w:p>
+      <w:pPr>
+        <w:textAlignment w:val="baseline"/>
+      </w:pPr>
+      <w:r>
+        <w:rPr>
+          <w:lang w:val="en-US"/>
+        </w:rPr>
+        <w:t>Vendor integration layers include</w:t>
+      </w:r>
+      <w:r>
+        <w:rPr>
+          <w:lang w:val="en-US"/>
+        </w:rPr>
+        <w:t xml:space="preserve"> Halo connect to be implemented in the project. </w:t>
+      </w:r>
+      <w:r>
+        <w:rPr>
+          <w:lang w:val="en-US"/>
+        </w:rPr>
+        <w:t xml:space="preserve">Halo </w:t>
+      </w:r>
+      <w:r>
+        <w:rPr>
+          <w:lang w:val="en-US"/>
+        </w:rPr>
+        <w:t xml:space="preserve">connect is an Australian healthcare platform </w:t>
+      </w:r>
+      <w:r>
+        <w:rPr>
+          <w:lang w:val="en-US"/>
+        </w:rPr>
+        <w:t xml:space="preserve">that safely links local medical practice systems to </w:t>
+      </w:r>
+      <w:r>
+        <w:rPr>
+          <w:lang w:val="en-US"/>
+        </w:rPr>
+        <w:t>cloud-based software.</w:t>
+      </w:r>
+      <w:r>
+        <w:rPr>
+          <w:lang w:val="en-US"/>
+        </w:rPr>
+        <w:t xml:space="preserve"> It has two main components Halo Link and </w:t>
+      </w:r>
+      <w:r>
+        <w:rPr>
+          <w:lang w:val="en-US"/>
+        </w:rPr>
+        <w:t>Halo Cloud</w:t>
       </w:r>
       <w:r>
         <w:rPr>
@@ -1215,71 +2015,13 @@
         <w:rPr>
           <w:lang w:val="en-US"/>
         </w:rPr>
-        <w:t xml:space="preserve"> These are all essential for the project </w:t>
-      </w:r>
-      <w:r>
-        <w:rPr>
-          <w:lang w:val="en-US"/>
-        </w:rPr>
-        <w:t>as it has to reflect the same standards as production systems.</w:t>
-      </w:r>
-    </w:p>
-    <w:p>
-      <w:pPr>
-        <w:textAlignment w:val="baseline"/>
-        <w:rPr>
-          <w:lang w:val="en-US"/>
-        </w:rPr>
-      </w:pPr>
-    </w:p>
-    <w:p>
-      <w:pPr>
-        <w:textAlignment w:val="baseline"/>
-        <w:rPr>
-          <w:lang w:val="en-US"/>
-        </w:rPr>
-      </w:pPr>
-      <w:r>
-        <w:rPr>
-          <w:lang w:val="en-US"/>
-        </w:rPr>
-        <w:t xml:space="preserve">FHIR </w:t>
-      </w:r>
-      <w:r>
-        <w:rPr>
-          <w:lang w:val="en-US"/>
-        </w:rPr>
-        <w:t>(</w:t>
-      </w:r>
-      <w:r>
-        <w:rPr>
-          <w:color w:val="000000"/>
-        </w:rPr>
-        <w:t>Fast Healthcare Interoperability Resources</w:t>
-      </w:r>
-      <w:r>
-        <w:rPr>
-          <w:lang w:val="en-US"/>
-        </w:rPr>
-        <w:t xml:space="preserve">) is the central exchange </w:t>
-      </w:r>
-      <w:r>
-        <w:rPr>
-          <w:lang w:val="en-US"/>
-        </w:rPr>
-        <w:t>standard that defines resources meaning patient data</w:t>
-      </w:r>
-      <w:r>
-        <w:rPr>
-          <w:lang w:val="en-US"/>
-        </w:rPr>
-        <w:t xml:space="preserve">, appointments, clinical notes and related information structure and </w:t>
-      </w:r>
-      <w:r>
-        <w:rPr>
-          <w:lang w:val="en-US"/>
-        </w:rPr>
-        <w:t>transferred between systems</w:t>
+        <w:t xml:space="preserve"> Halo Link is used to link the database to Halo cloud </w:t>
+      </w:r>
+      <w:r>
+        <w:rPr>
+          <w:lang w:val="en-US"/>
+        </w:rPr>
+        <w:t>and</w:t>
       </w:r>
       <w:r>
         <w:rPr>
@@ -1291,51 +2033,31 @@
         <w:rPr>
           <w:lang w:val="en-US"/>
         </w:rPr>
-        <w:t>(</w:t>
-      </w:r>
-      <w:proofErr w:type="spellStart"/>
-      <w:r>
-        <w:rPr>
-          <w:color w:val="000000"/>
-        </w:rPr>
-        <w:t>eCQI</w:t>
-      </w:r>
-      <w:proofErr w:type="spellEnd"/>
-      <w:r>
-        <w:rPr>
-          <w:color w:val="000000"/>
-        </w:rPr>
-        <w:t xml:space="preserve">, </w:t>
-      </w:r>
-      <w:r>
-        <w:rPr>
-          <w:color w:val="000000"/>
-        </w:rPr>
-        <w:t>2025)</w:t>
-      </w:r>
-      <w:r>
-        <w:rPr>
-          <w:lang w:val="en-US"/>
-        </w:rPr>
-        <w:t>.</w:t>
-      </w:r>
-      <w:r>
-        <w:rPr>
-          <w:lang w:val="en-US"/>
-        </w:rPr>
-        <w:t xml:space="preserve"> It also </w:t>
-      </w:r>
-      <w:r>
-        <w:rPr>
-          <w:lang w:val="en-US"/>
-        </w:rPr>
-        <w:t xml:space="preserve">depicts </w:t>
-      </w:r>
-      <w:r>
-        <w:rPr>
-          <w:lang w:val="en-US"/>
-        </w:rPr>
-        <w:t>interaction patterns including real time representation state Transfer (RESTful)</w:t>
+        <w:t>Halo Cloud</w:t>
+      </w:r>
+      <w:r>
+        <w:rPr>
+          <w:lang w:val="en-US"/>
+        </w:rPr>
+        <w:t xml:space="preserve"> would be required for</w:t>
+      </w:r>
+      <w:r>
+        <w:rPr>
+          <w:lang w:val="en-US"/>
+        </w:rPr>
+        <w:t xml:space="preserve"> sharing data using </w:t>
+      </w:r>
+      <w:r>
+        <w:rPr>
+          <w:lang w:val="en-US"/>
+        </w:rPr>
+        <w:t>standard formats like SQL and FHIR with approved external s</w:t>
+      </w:r>
+      <w:r>
+        <w:rPr>
+          <w:lang w:val="en-US"/>
+        </w:rPr>
+        <w:t>oftware.</w:t>
       </w:r>
       <w:r>
         <w:rPr>
@@ -1347,91 +2069,25 @@
         <w:rPr>
           <w:lang w:val="en-US"/>
         </w:rPr>
-        <w:t xml:space="preserve">application programming interfaces (APIs), </w:t>
-      </w:r>
-      <w:r>
-        <w:rPr>
-          <w:lang w:val="en-US"/>
-        </w:rPr>
-        <w:t xml:space="preserve">document based and messaging. </w:t>
-      </w:r>
-      <w:r>
-        <w:rPr>
-          <w:lang w:val="en-US"/>
-        </w:rPr>
-        <w:t>Th</w:t>
-      </w:r>
-      <w:r>
-        <w:rPr>
-          <w:lang w:val="en-US"/>
-        </w:rPr>
-        <w:t xml:space="preserve">e RESTful APIS use </w:t>
-      </w:r>
-      <w:r>
-        <w:rPr>
-          <w:lang w:val="en-US"/>
-        </w:rPr>
-        <w:t>HTTP</w:t>
-      </w:r>
-      <w:r>
-        <w:rPr>
-          <w:lang w:val="en-US"/>
-        </w:rPr>
-        <w:t xml:space="preserve"> operations to create, read, update and search for FHIR resources to enable real time </w:t>
-      </w:r>
-      <w:r>
-        <w:rPr>
-          <w:lang w:val="en-US"/>
-        </w:rPr>
-        <w:t xml:space="preserve">data exchange. </w:t>
-      </w:r>
-      <w:r>
-        <w:rPr>
-          <w:lang w:val="en-US"/>
-        </w:rPr>
-        <w:t>FHIR</w:t>
-      </w:r>
-      <w:r>
-        <w:rPr>
-          <w:lang w:val="en-US"/>
-        </w:rPr>
-        <w:t xml:space="preserve"> framework</w:t>
-      </w:r>
-      <w:r>
-        <w:rPr>
-          <w:lang w:val="en-US"/>
-        </w:rPr>
-        <w:t xml:space="preserve"> is </w:t>
-      </w:r>
-      <w:r>
-        <w:rPr>
-          <w:lang w:val="en-US"/>
-        </w:rPr>
-        <w:t xml:space="preserve">free to build commercial and </w:t>
-      </w:r>
-      <w:r>
-        <w:rPr>
-          <w:lang w:val="en-US"/>
-        </w:rPr>
-        <w:t>open-source</w:t>
-      </w:r>
-      <w:r>
-        <w:rPr>
-          <w:lang w:val="en-US"/>
-        </w:rPr>
-        <w:t xml:space="preserve"> tools</w:t>
-      </w:r>
-      <w:r>
-        <w:rPr>
-          <w:lang w:val="en-US"/>
-        </w:rPr>
-        <w:t xml:space="preserve"> while </w:t>
-      </w:r>
-      <w:r>
-        <w:rPr>
-          <w:lang w:val="en-US"/>
-        </w:rPr>
-        <w:t>HL7</w:t>
+        <w:t xml:space="preserve">This integration is necessary as </w:t>
+      </w:r>
+      <w:r>
+        <w:rPr>
+          <w:lang w:val="en-US"/>
+        </w:rPr>
+        <w:t>when the integration</w:t>
+      </w:r>
+      <w:r>
+        <w:rPr>
+          <w:lang w:val="en-US"/>
+        </w:rPr>
+        <w:t xml:space="preserve"> (another system)</w:t>
+      </w:r>
+      <w:r>
+        <w:rPr>
+          <w:lang w:val="en-US"/>
+        </w:rPr>
+        <w:t xml:space="preserve"> requires</w:t>
       </w:r>
       <w:r>
         <w:rPr>
@@ -1443,113 +2099,25 @@
         <w:rPr>
           <w:lang w:val="en-US"/>
         </w:rPr>
-        <w:t xml:space="preserve">is registered trademark that </w:t>
-      </w:r>
-      <w:r>
-        <w:rPr>
-          <w:lang w:val="en-US"/>
-        </w:rPr>
-        <w:t>cannot</w:t>
-      </w:r>
-      <w:r>
-        <w:rPr>
-          <w:lang w:val="en-US"/>
-        </w:rPr>
-        <w:t xml:space="preserve"> be used without permission. </w:t>
-      </w:r>
-      <w:r>
-        <w:rPr>
-          <w:lang w:val="en-US"/>
-        </w:rPr>
-        <w:t xml:space="preserve">FHIR is a necessity for the project to </w:t>
-      </w:r>
-      <w:r>
-        <w:rPr>
-          <w:lang w:val="en-US"/>
-        </w:rPr>
-        <w:t xml:space="preserve">mimic structured clinical document exchange </w:t>
-      </w:r>
-      <w:r>
-        <w:rPr>
-          <w:lang w:val="en-US"/>
-        </w:rPr>
-        <w:t>and</w:t>
-      </w:r>
-      <w:r>
-        <w:rPr>
-          <w:lang w:val="en-US"/>
-        </w:rPr>
-        <w:t xml:space="preserve"> be able to test </w:t>
-      </w:r>
-      <w:r>
-        <w:rPr>
-          <w:lang w:val="en-US"/>
-        </w:rPr>
-        <w:t>it.</w:t>
-      </w:r>
-    </w:p>
-    <w:p>
-      <w:pPr>
-        <w:textAlignment w:val="baseline"/>
-        <w:rPr>
-          <w:lang w:val="en-US"/>
-        </w:rPr>
-      </w:pPr>
-    </w:p>
-    <w:p>
-      <w:pPr>
-        <w:textAlignment w:val="baseline"/>
-        <w:rPr>
-          <w:lang w:val="en-US"/>
-        </w:rPr>
-      </w:pPr>
-      <w:r>
-        <w:rPr>
-          <w:lang w:val="en-US"/>
-        </w:rPr>
-        <w:t xml:space="preserve">Australian </w:t>
-      </w:r>
-      <w:r>
-        <w:rPr>
-          <w:lang w:val="en-US"/>
-        </w:rPr>
-        <w:t>clinical terminology</w:t>
-      </w:r>
-      <w:r>
-        <w:rPr>
-          <w:lang w:val="en-US"/>
-        </w:rPr>
-        <w:t xml:space="preserve"> and classification</w:t>
-      </w:r>
-      <w:r>
-        <w:rPr>
-          <w:lang w:val="en-US"/>
-        </w:rPr>
-        <w:t xml:space="preserve"> is vital which include SNOMED CT-AU</w:t>
-      </w:r>
-      <w:r>
-        <w:rPr>
-          <w:lang w:val="en-US"/>
-        </w:rPr>
-        <w:t xml:space="preserve"> and ICD-10-AM</w:t>
-      </w:r>
-      <w:r>
-        <w:rPr>
-          <w:lang w:val="en-US"/>
-        </w:rPr>
-        <w:t xml:space="preserve">. </w:t>
-      </w:r>
-      <w:r>
-        <w:rPr>
-          <w:lang w:val="en-US"/>
-        </w:rPr>
-        <w:t>SNOMED CT-AU</w:t>
-      </w:r>
-      <w:r>
-        <w:rPr>
-          <w:lang w:val="en-US"/>
-        </w:rPr>
-        <w:t xml:space="preserve"> is the preferred clinical terminology</w:t>
+        <w:t xml:space="preserve">data from the </w:t>
+      </w:r>
+      <w:r>
+        <w:rPr>
+          <w:lang w:val="en-US"/>
+        </w:rPr>
+        <w:t xml:space="preserve">server’s </w:t>
+      </w:r>
+      <w:r>
+        <w:rPr>
+          <w:lang w:val="en-US"/>
+        </w:rPr>
+        <w:t xml:space="preserve">database, it sends this </w:t>
+      </w:r>
+      <w:r>
+        <w:rPr>
+          <w:lang w:val="en-US"/>
+        </w:rPr>
+        <w:t>enquiry</w:t>
       </w:r>
       <w:r>
         <w:rPr>
@@ -1561,517 +2129,6 @@
         <w:rPr>
           <w:lang w:val="en-US"/>
         </w:rPr>
-        <w:t>in Australia</w:t>
-      </w:r>
-      <w:r>
-        <w:rPr>
-          <w:lang w:val="en-US"/>
-        </w:rPr>
-        <w:t xml:space="preserve"> which is an extension of the global </w:t>
-      </w:r>
-      <w:r>
-        <w:t xml:space="preserve">SNOMED </w:t>
-      </w:r>
-      <w:r>
-        <w:t>CT standard.</w:t>
-      </w:r>
-      <w:r>
-        <w:t xml:space="preserve"> </w:t>
-      </w:r>
-      <w:r>
-        <w:t>It combines international core clinical data with Australian-specific terms, spellings, local reference set</w:t>
-      </w:r>
-      <w:r>
-        <w:t>s</w:t>
-      </w:r>
-      <w:r>
-        <w:t xml:space="preserve"> and the Australian Medicines Terminology (AMT</w:t>
-      </w:r>
-      <w:r>
-        <w:t xml:space="preserve">). </w:t>
-      </w:r>
-      <w:r>
-        <w:rPr>
-          <w:lang w:val="en-US"/>
-        </w:rPr>
-        <w:t xml:space="preserve">SNOMED CT-AU </w:t>
-      </w:r>
-      <w:r>
-        <w:t>c</w:t>
-      </w:r>
-      <w:r>
-        <w:t xml:space="preserve">ontains </w:t>
-      </w:r>
-      <w:r>
-        <w:t xml:space="preserve">numerous </w:t>
-      </w:r>
-      <w:r>
-        <w:t xml:space="preserve">clinical concepts organized into hierarchies </w:t>
-      </w:r>
-      <w:r>
-        <w:t>like body structures, procedures</w:t>
-      </w:r>
-      <w:r>
-        <w:t xml:space="preserve"> </w:t>
-      </w:r>
-      <w:r>
-        <w:t>and clinical findings</w:t>
-      </w:r>
-      <w:r>
-        <w:t>.</w:t>
-      </w:r>
-      <w:r>
-        <w:t xml:space="preserve"> </w:t>
-      </w:r>
-      <w:r>
-        <w:rPr>
-          <w:lang w:val="en-US"/>
-        </w:rPr>
-        <w:t>SNOMED CT-AU</w:t>
-      </w:r>
-      <w:r>
-        <w:rPr>
-          <w:lang w:val="en-US"/>
-        </w:rPr>
-        <w:t xml:space="preserve"> is then mapped to ICD-10-AM</w:t>
-      </w:r>
-      <w:r>
-        <w:rPr>
-          <w:lang w:val="en-US"/>
-        </w:rPr>
-        <w:t xml:space="preserve"> </w:t>
-      </w:r>
-      <w:r>
-        <w:rPr>
-          <w:lang w:val="en-US"/>
-        </w:rPr>
-        <w:t xml:space="preserve">which is </w:t>
-      </w:r>
-      <w:r>
-        <w:rPr>
-          <w:lang w:val="en-US"/>
-        </w:rPr>
-        <w:t>classification of diseases and diagnosis</w:t>
-      </w:r>
-      <w:r>
-        <w:t xml:space="preserve"> </w:t>
-      </w:r>
-      <w:r>
-        <w:t>t</w:t>
-      </w:r>
-      <w:r>
-        <w:t>ailored to match Australian clinical terminology, practice and health-tracking need</w:t>
-      </w:r>
-      <w:r>
-        <w:t xml:space="preserve">. The </w:t>
-      </w:r>
-      <w:r>
-        <w:rPr>
-          <w:lang w:val="en-US"/>
-        </w:rPr>
-        <w:t>ICD-10-AM</w:t>
-      </w:r>
-      <w:r>
-        <w:rPr>
-          <w:lang w:val="en-US"/>
-        </w:rPr>
-        <w:t xml:space="preserve"> is mapped to MBS for billing in Australia. These terms need to be </w:t>
-      </w:r>
-      <w:r>
-        <w:rPr>
-          <w:lang w:val="en-US"/>
-        </w:rPr>
-        <w:t>coded</w:t>
-      </w:r>
-      <w:r>
-        <w:rPr>
-          <w:lang w:val="en-US"/>
-        </w:rPr>
-        <w:t xml:space="preserve"> </w:t>
-      </w:r>
-      <w:r>
-        <w:rPr>
-          <w:lang w:val="en-US"/>
-        </w:rPr>
-        <w:t xml:space="preserve">in the synthetic patient record </w:t>
-      </w:r>
-      <w:r>
-        <w:rPr>
-          <w:lang w:val="en-US"/>
-        </w:rPr>
-        <w:t xml:space="preserve">correctly as the test harness will </w:t>
-      </w:r>
-      <w:r>
-        <w:rPr>
-          <w:lang w:val="en-US"/>
-        </w:rPr>
-        <w:t>validate them.</w:t>
-      </w:r>
-      <w:r>
-        <w:rPr>
-          <w:lang w:val="en-US"/>
-        </w:rPr>
-        <w:t xml:space="preserve"> </w:t>
-      </w:r>
-      <w:r>
-        <w:rPr>
-          <w:lang w:val="en-US"/>
-        </w:rPr>
-        <w:t>These terminologies</w:t>
-      </w:r>
-      <w:r>
-        <w:rPr>
-          <w:lang w:val="en-US"/>
-        </w:rPr>
-        <w:t xml:space="preserve"> </w:t>
-      </w:r>
-      <w:r>
-        <w:rPr>
-          <w:lang w:val="en-US"/>
-        </w:rPr>
-        <w:t>are free access to code in synthetic data.</w:t>
-      </w:r>
-    </w:p>
-    <w:p>
-      <w:pPr>
-        <w:textAlignment w:val="baseline"/>
-        <w:rPr>
-          <w:lang w:val="en-US"/>
-        </w:rPr>
-      </w:pPr>
-    </w:p>
-    <w:p>
-      <w:pPr>
-        <w:textAlignment w:val="baseline"/>
-        <w:rPr>
-          <w:lang w:val="en-US"/>
-        </w:rPr>
-      </w:pPr>
-      <w:r>
-        <w:rPr>
-          <w:lang w:val="en-US"/>
-        </w:rPr>
-        <w:t xml:space="preserve">Synthea is currently one of the </w:t>
-      </w:r>
-      <w:r>
-        <w:rPr>
-          <w:lang w:val="en-US"/>
-        </w:rPr>
-        <w:t xml:space="preserve">most </w:t>
-      </w:r>
-      <w:r>
-        <w:rPr>
-          <w:lang w:val="en-US"/>
-        </w:rPr>
-        <w:t>credited</w:t>
-      </w:r>
-      <w:r>
-        <w:rPr>
-          <w:lang w:val="en-US"/>
-        </w:rPr>
-        <w:t xml:space="preserve"> synthetic </w:t>
-      </w:r>
-      <w:r>
-        <w:rPr>
-          <w:lang w:val="en-US"/>
-        </w:rPr>
-        <w:t xml:space="preserve">patient generator as it creates </w:t>
-      </w:r>
-      <w:r>
-        <w:rPr>
-          <w:lang w:val="en-US"/>
-        </w:rPr>
-        <w:t>realistic</w:t>
-      </w:r>
-      <w:r>
-        <w:rPr>
-          <w:lang w:val="en-US"/>
-        </w:rPr>
-        <w:t xml:space="preserve"> </w:t>
-      </w:r>
-      <w:r>
-        <w:t>realistic mock medical histories and electronic health records</w:t>
-      </w:r>
-      <w:r>
-        <w:t xml:space="preserve"> lifespan</w:t>
-      </w:r>
-      <w:r>
-        <w:t xml:space="preserve"> from birth to death.</w:t>
-      </w:r>
-      <w:r>
-        <w:t xml:space="preserve"> </w:t>
-      </w:r>
-      <w:r>
-        <w:t xml:space="preserve">Synthea is an open source but produces </w:t>
-      </w:r>
-      <w:r>
-        <w:t xml:space="preserve">mock patients based on Unites States of America demographics. </w:t>
-      </w:r>
-      <w:r>
-        <w:t xml:space="preserve">CSIRO have created Australian mock data using Australian </w:t>
-      </w:r>
-      <w:r>
-        <w:t>demographics,</w:t>
-      </w:r>
-      <w:r>
-        <w:t xml:space="preserve"> </w:t>
-      </w:r>
-      <w:r>
-        <w:t xml:space="preserve">but the </w:t>
-      </w:r>
-      <w:r>
-        <w:t xml:space="preserve">synthea </w:t>
-      </w:r>
-      <w:r>
-        <w:t>tool is not available for public</w:t>
-      </w:r>
-      <w:r>
-        <w:t>.</w:t>
-      </w:r>
-      <w:r>
-        <w:t xml:space="preserve"> </w:t>
-      </w:r>
-      <w:r>
-        <w:t>T</w:t>
-      </w:r>
-      <w:r>
-        <w:t>he mock data is available</w:t>
-      </w:r>
-      <w:r>
-        <w:t xml:space="preserve"> which would be used for this project to ensure compliance and </w:t>
-      </w:r>
-      <w:r>
-        <w:t>mimics</w:t>
-      </w:r>
-      <w:r>
-        <w:t xml:space="preserve"> real</w:t>
-      </w:r>
-      <w:r>
-        <w:t xml:space="preserve"> </w:t>
-      </w:r>
-      <w:r>
-        <w:t>clinical system.</w:t>
-      </w:r>
-      <w:r>
-        <w:t xml:space="preserve"> SMART </w:t>
-      </w:r>
-      <w:r>
-        <w:t xml:space="preserve">on FHIR </w:t>
-      </w:r>
-      <w:r>
-        <w:t xml:space="preserve">is the </w:t>
-      </w:r>
-      <w:r>
-        <w:t xml:space="preserve">authentication and authorising </w:t>
-      </w:r>
-      <w:r>
-        <w:t>secure system that lets third-party health apps log users in</w:t>
-      </w:r>
-      <w:r>
-        <w:t xml:space="preserve">, </w:t>
-      </w:r>
-      <w:r>
-        <w:t>access electronic health record (EHR) data using standard OAuth 2.0 protocols</w:t>
-      </w:r>
-      <w:r>
-        <w:t xml:space="preserve">. </w:t>
-      </w:r>
-      <w:r>
-        <w:t>This security is necessary to ensure that there is no authorised access to the Test harness.</w:t>
-      </w:r>
-    </w:p>
-    <w:p>
-      <w:pPr>
-        <w:textAlignment w:val="baseline"/>
-        <w:rPr>
-          <w:lang w:val="en-US"/>
-        </w:rPr>
-      </w:pPr>
-    </w:p>
-    <w:p>
-      <w:pPr>
-        <w:textAlignment w:val="baseline"/>
-        <w:rPr>
-          <w:lang w:val="en-US"/>
-        </w:rPr>
-      </w:pPr>
-    </w:p>
-    <w:p>
-      <w:pPr>
-        <w:textAlignment w:val="baseline"/>
-      </w:pPr>
-      <w:r>
-        <w:rPr>
-          <w:lang w:val="en-US"/>
-        </w:rPr>
-        <w:t>Vendor integration layers include</w:t>
-      </w:r>
-      <w:r>
-        <w:rPr>
-          <w:lang w:val="en-US"/>
-        </w:rPr>
-        <w:t xml:space="preserve"> Halo connect to be implemented in the project. </w:t>
-      </w:r>
-      <w:r>
-        <w:rPr>
-          <w:lang w:val="en-US"/>
-        </w:rPr>
-        <w:t xml:space="preserve">Halo </w:t>
-      </w:r>
-      <w:r>
-        <w:rPr>
-          <w:lang w:val="en-US"/>
-        </w:rPr>
-        <w:t xml:space="preserve">connect is an Australian healthcare platform </w:t>
-      </w:r>
-      <w:r>
-        <w:rPr>
-          <w:lang w:val="en-US"/>
-        </w:rPr>
-        <w:t xml:space="preserve">that safely links local medical practice systems to </w:t>
-      </w:r>
-      <w:r>
-        <w:rPr>
-          <w:lang w:val="en-US"/>
-        </w:rPr>
-        <w:t>cloud-based software.</w:t>
-      </w:r>
-      <w:r>
-        <w:rPr>
-          <w:lang w:val="en-US"/>
-        </w:rPr>
-        <w:t xml:space="preserve"> It has two main components Halo Link and </w:t>
-      </w:r>
-      <w:r>
-        <w:rPr>
-          <w:lang w:val="en-US"/>
-        </w:rPr>
-        <w:t>Halo Cloud</w:t>
-      </w:r>
-      <w:r>
-        <w:rPr>
-          <w:lang w:val="en-US"/>
-        </w:rPr>
-        <w:t>.</w:t>
-      </w:r>
-      <w:r>
-        <w:rPr>
-          <w:lang w:val="en-US"/>
-        </w:rPr>
-        <w:t xml:space="preserve"> Halo Link is used to link the database to Halo cloud </w:t>
-      </w:r>
-      <w:r>
-        <w:rPr>
-          <w:lang w:val="en-US"/>
-        </w:rPr>
-        <w:t>and</w:t>
-      </w:r>
-      <w:r>
-        <w:rPr>
-          <w:lang w:val="en-US"/>
-        </w:rPr>
-        <w:t xml:space="preserve"> </w:t>
-      </w:r>
-      <w:r>
-        <w:rPr>
-          <w:lang w:val="en-US"/>
-        </w:rPr>
-        <w:t>Halo Cloud</w:t>
-      </w:r>
-      <w:r>
-        <w:rPr>
-          <w:lang w:val="en-US"/>
-        </w:rPr>
-        <w:t xml:space="preserve"> would be required for</w:t>
-      </w:r>
-      <w:r>
-        <w:rPr>
-          <w:lang w:val="en-US"/>
-        </w:rPr>
-        <w:t xml:space="preserve"> sharing data using </w:t>
-      </w:r>
-      <w:r>
-        <w:rPr>
-          <w:lang w:val="en-US"/>
-        </w:rPr>
-        <w:t>standard formats like SQL and FHIR with approved external s</w:t>
-      </w:r>
-      <w:r>
-        <w:rPr>
-          <w:lang w:val="en-US"/>
-        </w:rPr>
-        <w:t>oftware.</w:t>
-      </w:r>
-      <w:r>
-        <w:rPr>
-          <w:lang w:val="en-US"/>
-        </w:rPr>
-        <w:t xml:space="preserve"> </w:t>
-      </w:r>
-      <w:r>
-        <w:rPr>
-          <w:lang w:val="en-US"/>
-        </w:rPr>
-        <w:t xml:space="preserve">This integration is necessary as </w:t>
-      </w:r>
-      <w:r>
-        <w:rPr>
-          <w:lang w:val="en-US"/>
-        </w:rPr>
-        <w:t>when the integration</w:t>
-      </w:r>
-      <w:r>
-        <w:rPr>
-          <w:lang w:val="en-US"/>
-        </w:rPr>
-        <w:t xml:space="preserve"> (another system)</w:t>
-      </w:r>
-      <w:r>
-        <w:rPr>
-          <w:lang w:val="en-US"/>
-        </w:rPr>
-        <w:t xml:space="preserve"> requires</w:t>
-      </w:r>
-      <w:r>
-        <w:rPr>
-          <w:lang w:val="en-US"/>
-        </w:rPr>
-        <w:t xml:space="preserve"> </w:t>
-      </w:r>
-      <w:r>
-        <w:rPr>
-          <w:lang w:val="en-US"/>
-        </w:rPr>
-        <w:t xml:space="preserve">data from the </w:t>
-      </w:r>
-      <w:r>
-        <w:rPr>
-          <w:lang w:val="en-US"/>
-        </w:rPr>
-        <w:t xml:space="preserve">server’s </w:t>
-      </w:r>
-      <w:r>
-        <w:rPr>
-          <w:lang w:val="en-US"/>
-        </w:rPr>
-        <w:t xml:space="preserve">database, it sends this </w:t>
-      </w:r>
-      <w:r>
-        <w:rPr>
-          <w:lang w:val="en-US"/>
-        </w:rPr>
-        <w:t>enquiry</w:t>
-      </w:r>
-      <w:r>
-        <w:rPr>
-          <w:lang w:val="en-US"/>
-        </w:rPr>
-        <w:t xml:space="preserve"> </w:t>
-      </w:r>
-      <w:r>
-        <w:rPr>
-          <w:lang w:val="en-US"/>
-        </w:rPr>
         <w:t>to the</w:t>
       </w:r>
       <w:r>
@@ -2118,11 +2175,7 @@
         <w:t xml:space="preserve">and terminology systems define how meaning should be coded. </w:t>
       </w:r>
       <w:r>
-        <w:t xml:space="preserve">This still then </w:t>
-      </w:r>
-      <w:r>
-        <w:lastRenderedPageBreak/>
-        <w:t>requires a synthetic test harness that utili</w:t>
+        <w:t>This still then requires a synthetic test harness that utili</w:t>
       </w:r>
       <w:r>
         <w:t xml:space="preserve">ses all these tools, standards and frameworks to form a </w:t>
@@ -2355,13 +2408,7 @@
               <w:rPr>
                 <w:color w:val="000000"/>
               </w:rPr>
-              <w:t xml:space="preserve"> (</w:t>
-            </w:r>
-            <w:r>
-              <w:rPr>
-                <w:color w:val="000000"/>
-              </w:rPr>
-              <w:t>SMART on FHIR, n.d.)</w:t>
+              <w:t xml:space="preserve"> (SMART on FHIR, n.d.)</w:t>
             </w:r>
             <w:r>
               <w:rPr>
@@ -2476,7 +2523,14 @@
               <w:rPr>
                 <w:color w:val="000000"/>
               </w:rPr>
-              <w:t>eveloper ecosystem for building and distributing applications that integrate with Epic EHR. Provides APIs based on </w:t>
+              <w:t xml:space="preserve">eveloper ecosystem for building and distributing applications that integrate with Epic EHR. Provides APIs based </w:t>
+            </w:r>
+            <w:r>
+              <w:rPr>
+                <w:color w:val="000000"/>
+              </w:rPr>
+              <w:lastRenderedPageBreak/>
+              <w:t>on </w:t>
             </w:r>
             <w:r>
               <w:rPr>
@@ -2539,6 +2593,7 @@
               <w:rPr>
                 <w:color w:val="000000"/>
               </w:rPr>
+              <w:lastRenderedPageBreak/>
               <w:t>Cloud/</w:t>
             </w:r>
             <w:r>
@@ -2567,10 +2622,7 @@
               </w:rPr>
             </w:pPr>
             <w:r>
-              <w:t>I</w:t>
-            </w:r>
-            <w:r>
-              <w:t>ntegration can involve </w:t>
+              <w:t>Integration can involve </w:t>
             </w:r>
             <w:r>
               <w:rPr>
@@ -2631,6 +2683,7 @@
               <w:rPr>
                 <w:color w:val="000000"/>
               </w:rPr>
+              <w:lastRenderedPageBreak/>
               <w:t xml:space="preserve">Relevant but </w:t>
             </w:r>
             <w:r>
@@ -2689,13 +2742,7 @@
               <w:rPr>
                 <w:color w:val="000000"/>
               </w:rPr>
-              <w:t>(MediRecords Connect</w:t>
-            </w:r>
-            <w:r>
-              <w:rPr>
-                <w:color w:val="000000"/>
-              </w:rPr>
-              <w:t>, 2026</w:t>
+              <w:t>(MediRecords Connect, 2026</w:t>
             </w:r>
             <w:r>
               <w:rPr>
@@ -2799,14 +2846,7 @@
               <w:rPr>
                 <w:color w:val="000000"/>
               </w:rPr>
-              <w:t xml:space="preserve">xe HealthX </w:t>
-            </w:r>
-            <w:r>
-              <w:rPr>
-                <w:color w:val="000000"/>
-              </w:rPr>
-              <w:lastRenderedPageBreak/>
-              <w:t xml:space="preserve">innovation </w:t>
+              <w:t xml:space="preserve">xe HealthX innovation </w:t>
             </w:r>
             <w:proofErr w:type="spellStart"/>
             <w:r>
@@ -2833,15 +2873,7 @@
               <w:rPr>
                 <w:color w:val="000000"/>
               </w:rPr>
-              <w:lastRenderedPageBreak/>
-              <w:t>Provides an innovation and experimentatio</w:t>
-            </w:r>
-            <w:r>
-              <w:rPr>
-                <w:color w:val="000000"/>
-              </w:rPr>
-              <w:lastRenderedPageBreak/>
-              <w:t>n environment for healthcare technologies, supporting testing, prototyping and validation of digital health solutions and interoperability concepts within a healthcare ecosystem</w:t>
+              <w:t>Provides an innovation and experimentation environment for healthcare technologies, supporting testing, prototyping and validation of digital health solutions and interoperability concepts within a healthcare ecosystem</w:t>
             </w:r>
             <w:r>
               <w:rPr>
@@ -2878,21 +2910,13 @@
               <w:rPr>
                 <w:color w:val="000000"/>
               </w:rPr>
-              <w:lastRenderedPageBreak/>
               <w:t>Innovation sandbox/</w:t>
             </w:r>
             <w:r>
               <w:rPr>
                 <w:color w:val="000000"/>
               </w:rPr>
-              <w:t xml:space="preserve"> testing </w:t>
-            </w:r>
-            <w:r>
-              <w:rPr>
-                <w:color w:val="000000"/>
-              </w:rPr>
-              <w:lastRenderedPageBreak/>
-              <w:t>environment</w:t>
+              <w:t xml:space="preserve"> testing environment</w:t>
             </w:r>
           </w:p>
         </w:tc>
@@ -2911,21 +2935,13 @@
               <w:rPr>
                 <w:color w:val="000000"/>
               </w:rPr>
-              <w:lastRenderedPageBreak/>
               <w:t>Primarily focused on Singapore</w:t>
             </w:r>
             <w:r>
               <w:rPr>
                 <w:color w:val="000000"/>
               </w:rPr>
-              <w:t xml:space="preserve">’s healthcare </w:t>
-            </w:r>
-            <w:r>
-              <w:rPr>
-                <w:color w:val="000000"/>
-              </w:rPr>
-              <w:lastRenderedPageBreak/>
-              <w:t>ecosystem different from Australian.</w:t>
+              <w:t>’s healthcare ecosystem different from Australian.</w:t>
             </w:r>
           </w:p>
         </w:tc>
@@ -2944,15 +2960,7 @@
               <w:rPr>
                 <w:color w:val="000000"/>
               </w:rPr>
-              <w:lastRenderedPageBreak/>
-              <w:t xml:space="preserve">Moderately relevant as a reference model for testing </w:t>
-            </w:r>
-            <w:r>
-              <w:rPr>
-                <w:color w:val="000000"/>
-              </w:rPr>
-              <w:lastRenderedPageBreak/>
-              <w:t>healthcare technologies</w:t>
+              <w:t>Moderately relevant as a reference model for testing healthcare technologies</w:t>
             </w:r>
           </w:p>
         </w:tc>
@@ -3179,7 +3187,14 @@
         <w:rPr>
           <w:lang w:val="en-US"/>
         </w:rPr>
-        <w:t>terminology to ensure that clinical concepts retain their intended meanin</w:t>
+        <w:t xml:space="preserve">terminology to </w:t>
+      </w:r>
+      <w:r>
+        <w:rPr>
+          <w:lang w:val="en-US"/>
+        </w:rPr>
+        <w:lastRenderedPageBreak/>
+        <w:t>ensure that clinical concepts retain their intended meanin</w:t>
       </w:r>
       <w:r>
         <w:rPr>
@@ -3703,15 +3718,22 @@
         <w:rPr>
           <w:lang w:val="en-US"/>
         </w:rPr>
-        <w:lastRenderedPageBreak/>
         <w:t>The existing integration approach</w:t>
       </w:r>
       <w:r>
         <w:rPr>
           <w:lang w:val="en-US"/>
         </w:rPr>
-        <w:t xml:space="preserve"> does not provide an independently</w:t>
-      </w:r>
+        <w:t xml:space="preserve"> does not provide an </w:t>
+      </w:r>
+      <w:proofErr w:type="gramStart"/>
+      <w:r>
+        <w:rPr>
+          <w:lang w:val="en-US"/>
+        </w:rPr>
+        <w:t>independently</w:t>
+      </w:r>
+      <w:proofErr w:type="gramEnd"/>
       <w:r>
         <w:rPr>
           <w:lang w:val="en-US"/>
@@ -3978,11 +4000,19 @@
         </w:rPr>
         <w:t xml:space="preserve">is no automation, each release requires human checks which </w:t>
       </w:r>
-      <w:r>
-        <w:rPr>
-          <w:lang w:val="en-US"/>
-        </w:rPr>
-        <w:t>is slow and prone to errors. The p</w:t>
+      <w:proofErr w:type="gramStart"/>
+      <w:r>
+        <w:rPr>
+          <w:lang w:val="en-US"/>
+        </w:rPr>
+        <w:t>is</w:t>
+      </w:r>
+      <w:proofErr w:type="gramEnd"/>
+      <w:r>
+        <w:rPr>
+          <w:lang w:val="en-US"/>
+        </w:rPr>
+        <w:t xml:space="preserve"> slow and prone to errors. The p</w:t>
       </w:r>
       <w:r>
         <w:rPr>
@@ -4088,7 +4118,21 @@
         <w:rPr>
           <w:lang w:val="en-US"/>
         </w:rPr>
-        <w:t>consistent validation process.</w:t>
+        <w:t xml:space="preserve">consistent validation </w:t>
+      </w:r>
+      <w:proofErr w:type="gramStart"/>
+      <w:r>
+        <w:rPr>
+          <w:lang w:val="en-US"/>
+        </w:rPr>
+        <w:t>process</w:t>
+      </w:r>
+      <w:proofErr w:type="gramEnd"/>
+      <w:r>
+        <w:rPr>
+          <w:lang w:val="en-US"/>
+        </w:rPr>
+        <w:t>.</w:t>
       </w:r>
       <w:r>
         <w:rPr>
@@ -4364,7 +4408,7 @@
         </w:rPr>
         <w:t xml:space="preserve">. Healthit.Gov. </w:t>
       </w:r>
-      <w:hyperlink r:id="rId4" w:history="1">
+      <w:hyperlink r:id="rId5" w:history="1">
         <w:r>
           <w:rPr>
             <w:rStyle w:val="Hyperlink"/>
@@ -4444,7 +4488,6 @@
         <w:rPr>
           <w:color w:val="000000"/>
         </w:rPr>
-        <w:lastRenderedPageBreak/>
         <w:t>MedTalk AI.</w:t>
       </w:r>
       <w:r>
@@ -4513,7 +4556,7 @@
         </w:rPr>
         <w:t xml:space="preserve">. (2026). Medibetter.Com.Au. </w:t>
       </w:r>
-      <w:hyperlink r:id="rId5" w:history="1">
+      <w:hyperlink r:id="rId6" w:history="1">
         <w:r>
           <w:rPr>
             <w:rStyle w:val="Hyperlink"/>
@@ -4573,7 +4616,21 @@
         <w:rPr>
           <w:color w:val="000000"/>
         </w:rPr>
-        <w:t xml:space="preserve">. (2025, ). </w:t>
+        <w:t>. (2025</w:t>
+      </w:r>
+      <w:proofErr w:type="gramStart"/>
+      <w:r>
+        <w:rPr>
+          <w:color w:val="000000"/>
+        </w:rPr>
+        <w:t>, )</w:t>
+      </w:r>
+      <w:proofErr w:type="gramEnd"/>
+      <w:r>
+        <w:rPr>
+          <w:color w:val="000000"/>
+        </w:rPr>
+        <w:t xml:space="preserve">. </w:t>
       </w:r>
       <w:proofErr w:type="spellStart"/>
       <w:r>
@@ -4589,7 +4646,7 @@
         </w:rPr>
         <w:t xml:space="preserve">. </w:t>
       </w:r>
-      <w:hyperlink r:id="rId6" w:history="1">
+      <w:hyperlink r:id="rId7" w:history="1">
         <w:r>
           <w:rPr>
             <w:rStyle w:val="Hyperlink"/>
@@ -4626,7 +4683,25 @@
           <w:iCs/>
           <w:color w:val="000000"/>
         </w:rPr>
-        <w:t>How to Get Your App Into Epic (2026)</w:t>
+        <w:t xml:space="preserve">How to Get Your App </w:t>
+      </w:r>
+      <w:proofErr w:type="gramStart"/>
+      <w:r>
+        <w:rPr>
+          <w:i/>
+          <w:iCs/>
+          <w:color w:val="000000"/>
+        </w:rPr>
+        <w:t>Into</w:t>
+      </w:r>
+      <w:proofErr w:type="gramEnd"/>
+      <w:r>
+        <w:rPr>
+          <w:i/>
+          <w:iCs/>
+          <w:color w:val="000000"/>
+        </w:rPr>
+        <w:t xml:space="preserve"> Epic (2026)</w:t>
       </w:r>
       <w:r>
         <w:rPr>
@@ -4648,7 +4723,7 @@
         </w:rPr>
         <w:t xml:space="preserve">. </w:t>
       </w:r>
-      <w:hyperlink r:id="rId7" w:history="1">
+      <w:hyperlink r:id="rId8" w:history="1">
         <w:r>
           <w:rPr>
             <w:rStyle w:val="Hyperlink"/>
@@ -4721,7 +4796,7 @@
         </w:rPr>
         <w:t xml:space="preserve">. (n.d.). Docs.Smarthealthit.Org. Retrieved September 11, 2026, from </w:t>
       </w:r>
-      <w:hyperlink r:id="rId8" w:history="1">
+      <w:hyperlink r:id="rId9" w:history="1">
         <w:r>
           <w:rPr>
             <w:rStyle w:val="Hyperlink"/>
@@ -4765,7 +4840,7 @@
         </w:rPr>
         <w:t xml:space="preserve">. Bonami Software. </w:t>
       </w:r>
-      <w:hyperlink r:id="rId9" w:history="1">
+      <w:hyperlink r:id="rId10" w:history="1">
         <w:r>
           <w:rPr>
             <w:rStyle w:val="Hyperlink"/>
@@ -4803,7 +4878,7 @@
         </w:rPr>
         <w:t xml:space="preserve">. (2026). Knowledge Base. </w:t>
       </w:r>
-      <w:hyperlink r:id="rId10" w:history="1">
+      <w:hyperlink r:id="rId11" w:history="1">
         <w:r>
           <w:rPr>
             <w:rStyle w:val="Hyperlink"/>
@@ -4833,6 +4908,7 @@
           <w:iCs/>
           <w:color w:val="000000"/>
         </w:rPr>
+        <w:lastRenderedPageBreak/>
         <w:t>Synapxe - HealthX Innovation Sandbox</w:t>
       </w:r>
       <w:r>
@@ -5539,6 +5615,7 @@
   <w:style w:type="character" w:default="1" w:styleId="DefaultParagraphFont">
     <w:name w:val="Default Paragraph Font"/>
     <w:uiPriority w:val="1"/>
+    <w:semiHidden/>
     <w:unhideWhenUsed/>
   </w:style>
   <w:style w:type="table" w:default="1" w:styleId="TableNormal">

</xml_diff>